<commit_message>
feat(mau-13, mau-08): Mẫu 13 dựng lại từ biểu mẫu gốc theo từng biên bản (mục I/II theo thẩm quyền, cột Chưa đánh giá, Tổ kiểm phiếu, số phiếu); Mẫu 08 bản Excel theo HD03 V.1
</commit_message>
<xml_diff>
--- a/backend/src/CongTacDang.Infrastructure/Templates/Word/Mau_13_BienBanKiemPhieu.docx
+++ b/backend/src/CongTacDang.Infrastructure/Templates/Word/Mau_13_BienBanKiemPhieu.docx
@@ -1,6 +1,6 @@
 
 <file path=word/document.xml><?xml version="1.0" encoding="utf-8"?>
-<w:document xmlns:a="http://schemas.openxmlformats.org/drawingml/2006/main" xmlns:wpc="http://schemas.microsoft.com/office/word/2010/wordprocessingCanvas" xmlns:cx="http://schemas.microsoft.com/office/drawing/2014/chartex" xmlns:cx1="http://schemas.microsoft.com/office/drawing/2015/9/8/chartex" xmlns:cx2="http://schemas.microsoft.com/office/drawing/2015/10/21/chartex" xmlns:cx3="http://schemas.microsoft.com/office/drawing/2016/5/9/chartex" xmlns:cx4="http://schemas.microsoft.com/office/drawing/2016/5/10/chartex" xmlns:cx5="http://schemas.microsoft.com/office/drawing/2016/5/11/chartex" xmlns:cx6="http://schemas.microsoft.com/office/drawing/2016/5/12/chartex" xmlns:cx7="http://schemas.microsoft.com/office/drawing/2016/5/13/chartex" xmlns:cx8="http://schemas.microsoft.com/office/drawing/2016/5/14/chartex" xmlns:mc="http://schemas.openxmlformats.org/markup-compatibility/2006" xmlns:aink="http://schemas.microsoft.com/office/drawing/2016/ink" xmlns:am3d="http://schemas.microsoft.com/office/drawing/2017/model3d" xmlns:o="urn:schemas-microsoft-com:office:office" xmlns:oel="http://schemas.microsoft.com/office/2019/extlst" xmlns:r="http://schemas.openxmlformats.org/officeDocument/2006/relationships" xmlns:m="http://schemas.openxmlformats.org/officeDocument/2006/math" xmlns:v="urn:schemas-microsoft-com:vml" xmlns:wp14="http://schemas.microsoft.com/office/word/2010/wordprocessingDrawing" xmlns:wp="http://schemas.openxmlformats.org/drawingml/2006/wordprocessingDrawing" xmlns:w10="urn:schemas-microsoft-com:office:word" xmlns:w="http://schemas.openxmlformats.org/wordprocessingml/2006/main" xmlns:w14="http://schemas.microsoft.com/office/word/2010/wordml" xmlns:w15="http://schemas.microsoft.com/office/word/2012/wordml" xmlns:w16cex="http://schemas.microsoft.com/office/word/2018/wordml/cex" xmlns:w16cid="http://schemas.microsoft.com/office/word/2016/wordml/cid" xmlns:w16="http://schemas.microsoft.com/office/word/2018/wordml" xmlns:w16du="http://schemas.microsoft.com/office/word/2023/wordml/word16du" xmlns:w16sdtdh="http://schemas.microsoft.com/office/word/2020/wordml/sdtdatahash" xmlns:w16sdtfl="http://schemas.microsoft.com/office/word/2024/wordml/sdtformatlock" xmlns:w16se="http://schemas.microsoft.com/office/word/2015/wordml/symex" xmlns:wpg="http://schemas.microsoft.com/office/word/2010/wordprocessingGroup" xmlns:wpi="http://schemas.microsoft.com/office/word/2010/wordprocessingInk" xmlns:wne="http://schemas.microsoft.com/office/word/2006/wordml" xmlns:wps="http://schemas.microsoft.com/office/word/2010/wordprocessingShape" mc:Ignorable="w14 w15 w16se w16cid w16 w16cex w16sdtdh w16sdtfl w16du wp14">
+<w:document xmlns:wpc="http://schemas.microsoft.com/office/word/2010/wordprocessingCanvas" xmlns:cx="http://schemas.microsoft.com/office/drawing/2014/chartex" xmlns:cx1="http://schemas.microsoft.com/office/drawing/2015/9/8/chartex" xmlns:cx2="http://schemas.microsoft.com/office/drawing/2015/10/21/chartex" xmlns:cx3="http://schemas.microsoft.com/office/drawing/2016/5/9/chartex" xmlns:cx4="http://schemas.microsoft.com/office/drawing/2016/5/10/chartex" xmlns:cx5="http://schemas.microsoft.com/office/drawing/2016/5/11/chartex" xmlns:cx6="http://schemas.microsoft.com/office/drawing/2016/5/12/chartex" xmlns:cx7="http://schemas.microsoft.com/office/drawing/2016/5/13/chartex" xmlns:cx8="http://schemas.microsoft.com/office/drawing/2016/5/14/chartex" xmlns:mc="http://schemas.openxmlformats.org/markup-compatibility/2006" xmlns:aink="http://schemas.microsoft.com/office/drawing/2016/ink" xmlns:am3d="http://schemas.microsoft.com/office/drawing/2017/model3d" xmlns:o="urn:schemas-microsoft-com:office:office" xmlns:oel="http://schemas.microsoft.com/office/2019/extlst" xmlns:r="http://schemas.openxmlformats.org/officeDocument/2006/relationships" xmlns:m="http://schemas.openxmlformats.org/officeDocument/2006/math" xmlns:v="urn:schemas-microsoft-com:vml" xmlns:wp14="http://schemas.microsoft.com/office/word/2010/wordprocessingDrawing" xmlns:wp="http://schemas.openxmlformats.org/drawingml/2006/wordprocessingDrawing" xmlns:w10="urn:schemas-microsoft-com:office:word" xmlns:w="http://schemas.openxmlformats.org/wordprocessingml/2006/main" xmlns:w14="http://schemas.microsoft.com/office/word/2010/wordml" xmlns:w15="http://schemas.microsoft.com/office/word/2012/wordml" xmlns:w16cex="http://schemas.microsoft.com/office/word/2018/wordml/cex" xmlns:w16cid="http://schemas.microsoft.com/office/word/2016/wordml/cid" xmlns:w16="http://schemas.microsoft.com/office/word/2018/wordml" xmlns:w16du="http://schemas.microsoft.com/office/word/2023/wordml/word16du" xmlns:w16sdtdh="http://schemas.microsoft.com/office/word/2020/wordml/sdtdatahash" xmlns:w16sdtfl="http://schemas.microsoft.com/office/word/2024/wordml/sdtformatlock" xmlns:w16se="http://schemas.microsoft.com/office/word/2015/wordml/symex" xmlns:wpg="http://schemas.microsoft.com/office/word/2010/wordprocessingGroup" xmlns:wpi="http://schemas.microsoft.com/office/word/2010/wordprocessingInk" xmlns:wne="http://schemas.microsoft.com/office/word/2006/wordml" xmlns:wps="http://schemas.microsoft.com/office/word/2010/wordprocessingShape" mc:Ignorable="w14 w15 w16se w16cid w16 w16cex w16sdtdh w16sdtfl w16du wp14">
   <w:body>
     <w:p>
       <w:pPr>
@@ -50,13 +50,13 @@
             </w:pPr>
             <w:sdt>
               <w:sdtPr>
-                <w:alias w:val="ORG_SUPERIOR_PARTY_NAME"/>
-                <w:tag w:val="ORG_SUPERIOR_PARTY_NAME"/>
-                <w:id w:val="531009"/>
+                <w:alias w:val="PARTY_PARENT"/>
+                <w:tag w:val="PARTY_PARENT"/>
+                <w:id w:val="913001"/>
               </w:sdtPr>
               <w:sdtContent>
                 <w:r>
-                  <w:t>ĐẢNG BỘ TCT QUẢN LÝ BAY VIỆT NAM</w:t>
+                  <w:t xml:space="preserve">ĐẢNG BỘ…</w:t>
                 </w:r>
               </w:sdtContent>
             </w:sdt>
@@ -71,16 +71,16 @@
             </w:pPr>
             <w:sdt>
               <w:sdtPr>
-                <w:alias w:val="PARTY_CELL"/>
-                <w:tag w:val="PARTY_CELL"/>
-                <w:id w:val="510066"/>
+                <w:alias w:val="PARTY_ORG"/>
+                <w:tag w:val="PARTY_ORG"/>
+                <w:id w:val="913002"/>
               </w:sdtPr>
               <w:sdtContent>
                 <w:r>
                   <w:rPr>
                     <w:b/>
                   </w:rPr>
-                  <w:t xml:space="preserve">CHI BỘ CƠ SỞ TRỰC THUỘC</w:t>
+                  <w:t xml:space="preserve">ĐẢNG ỦY (CHI BỘ)…</w:t>
                 </w:r>
               </w:sdtContent>
             </w:sdt>
@@ -130,7 +130,7 @@
               <mc:AlternateContent>
                 <mc:Choice Requires="wps">
                   <w:drawing>
-                    <wp:anchor distT="4294967295" distB="4294967295" distL="114300" distR="114300" simplePos="0" relativeHeight="251666432" behindDoc="0" locked="0" layoutInCell="1" allowOverlap="1" wp14:editId="61ACECB0" wp14:anchorId="7AC7E519">
+                    <wp:anchor distT="4294967295" distB="4294967295" distL="114300" distR="114300" simplePos="0" relativeHeight="251666432" behindDoc="0" locked="0" layoutInCell="1" allowOverlap="1" wp14:anchorId="7AC7E519" wp14:editId="61ACECB0">
                       <wp:simplePos x="0" y="0"/>
                       <wp:positionH relativeFrom="column">
                         <wp:posOffset>593725</wp:posOffset>
@@ -184,7 +184,7 @@
                 </mc:Choice>
                 <mc:Fallback>
                   <w:pict>
-                    <v:line id="Straight Connector 1" style="position:absolute;z-index:251666432;visibility:visible;mso-wrap-style:square;mso-width-percent:0;mso-height-percent:0;mso-wrap-distance-left:9pt;mso-wrap-distance-top:-3e-5mm;mso-wrap-distance-right:9pt;mso-wrap-distance-bottom:-3e-5mm;mso-position-horizontal:absolute;mso-position-horizontal-relative:text;mso-position-vertical:absolute;mso-position-vertical-relative:text;mso-width-percent:0;mso-height-percent:0;mso-width-relative:page;mso-height-relative:page" o:spid="_x0000_s1026" o:gfxdata="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" from="46.75pt,2.35pt" to="240.15pt,2.35pt" w14:anchorId="22064F0E"/>
+                    <v:line id="Straight Connector 1" o:spid="_x0000_s1026" style="position:absolute;z-index:251666432;visibility:visible;mso-wrap-style:square;mso-width-percent:0;mso-height-percent:0;mso-wrap-distance-left:9pt;mso-wrap-distance-top:-3e-5mm;mso-wrap-distance-right:9pt;mso-wrap-distance-bottom:-3e-5mm;mso-position-horizontal:absolute;mso-position-horizontal-relative:text;mso-position-vertical:absolute;mso-position-vertical-relative:text;mso-width-percent:0;mso-height-percent:0;mso-width-relative:page;mso-height-relative:page" from="46.75pt,2.35pt" to="240.15pt,2.35pt" o:gfxdata="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"/>
                   </w:pict>
                 </mc:Fallback>
               </mc:AlternateContent>
@@ -253,6 +253,24 @@
           <w:lang w:val="en-US"/>
         </w:rPr>
       </w:pPr>
+      <w:sdt>
+        <w:sdtPr>
+          <w:alias w:val="MEETING_NAME"/>
+          <w:tag w:val="MEETING_NAME"/>
+          <w:id w:val="913003"/>
+        </w:sdtPr>
+        <w:sdtContent>
+          <w:r>
+            <w:rPr>
+              <w:b/>
+              <w:color w:val="EE0000"/>
+              <w:sz w:val="28"/>
+              <w:szCs w:val="28"/>
+            </w:rPr>
+            <w:t xml:space="preserve">Hội nghị tập thể lãnh đạo, quản lý… (ghi tên Phòng/Trung tâm, Ban/Đơn vị) hoặc Hội nghị Đảng ủy/Chi ủy cơ sở… (ghi tên đảng ủy/chi ủy cơ sở)</w:t>
+          </w:r>
+        </w:sdtContent>
+      </w:sdt>
       <w:r>
         <w:rPr>
           <w:b/>
@@ -260,37 +278,46 @@
           <w:sz w:val="28"/>
           <w:szCs w:val="28"/>
         </w:rPr>
-        <w:t xml:space="preserve">Hội nghị tập thể lãnh đạo, quản lý… (ghi tên Phòng/Trung tâm, Ban/Đơn vị) hoặc Hội nghị Đảng ủy/Chi ủy cơ sở… (ghi tên đảng ủy/chi ủy cơ sở) về việc đánh giá, xếp loại chất lượng cán bộ quý </w:t>
+        <w:t xml:space="preserve"> về việc đánh giá, xếp loại chất lượng cán bộ quý </w:t>
       </w:r>
-      <w:r>
-        <w:rPr>
-          <w:b/>
-          <w:color w:val="EE0000"/>
-          <w:sz w:val="28"/>
-          <w:szCs w:val="28"/>
-          <w:lang w:val="en-US"/>
-        </w:rPr>
-        <w:t>……..</w:t>
-      </w:r>
-      <w:r>
-        <w:rPr>
-          <w:b/>
-          <w:color w:val="EE0000"/>
-          <w:sz w:val="28"/>
-          <w:szCs w:val="28"/>
-        </w:rPr>
-        <w:t>/</w:t>
-      </w:r>
-      <w:r>
-        <w:rPr>
-          <w:b/>
-          <w:color w:val="EE0000"/>
-          <w:sz w:val="28"/>
-          <w:szCs w:val="28"/>
-          <w:lang w:val="en-US"/>
-        </w:rPr>
-        <w:t>…..</w:t>
-      </w:r>
+      <w:sdt>
+        <w:sdtPr>
+          <w:alias w:val="QUARTER_YEAR"/>
+          <w:tag w:val="QUARTER_YEAR"/>
+          <w:id w:val="913004"/>
+        </w:sdtPr>
+        <w:sdtContent>
+          <w:r>
+            <w:rPr>
+              <w:b/>
+              <w:color w:val="EE0000"/>
+              <w:sz w:val="28"/>
+              <w:szCs w:val="28"/>
+              <w:lang w:val="en-US"/>
+            </w:rPr>
+            <w:t xml:space="preserve">……..</w:t>
+          </w:r>
+          <w:r>
+            <w:rPr>
+              <w:b/>
+              <w:color w:val="EE0000"/>
+              <w:sz w:val="28"/>
+              <w:szCs w:val="28"/>
+            </w:rPr>
+            <w:t xml:space="preserve">/</w:t>
+          </w:r>
+          <w:r>
+            <w:rPr>
+              <w:b/>
+              <w:color w:val="EE0000"/>
+              <w:sz w:val="28"/>
+              <w:szCs w:val="28"/>
+              <w:lang w:val="en-US"/>
+            </w:rPr>
+            <w:t xml:space="preserve">…..</w:t>
+          </w:r>
+        </w:sdtContent>
+      </w:sdt>
     </w:p>
     <w:p>
       <w:pPr>
@@ -384,7 +411,32 @@
           <w:szCs w:val="28"/>
           <w:lang w:val="vi-VN"/>
         </w:rPr>
-        <w:t>Căn cứ Quy chế làm việc của… nhiệm kỳ…;</w:t>
+        <w:t xml:space="preserve">Căn cứ Quy chế làm việc của</w:t>
+      </w:r>
+      <w:sdt>
+        <w:sdtPr>
+          <w:alias w:val="WORKING_RULES"/>
+          <w:tag w:val="WORKING_RULES"/>
+          <w:id w:val="913005"/>
+        </w:sdtPr>
+        <w:sdtContent>
+          <w:r>
+            <w:rPr>
+              <w:sz w:val="28"/>
+              <w:szCs w:val="28"/>
+              <w:lang w:val="vi-VN"/>
+            </w:rPr>
+            <w:t xml:space="preserve">… nhiệm kỳ…</w:t>
+          </w:r>
+        </w:sdtContent>
+      </w:sdt>
+      <w:r>
+        <w:rPr>
+          <w:sz w:val="28"/>
+          <w:szCs w:val="28"/>
+          <w:lang w:val="vi-VN"/>
+        </w:rPr>
+        <w:t xml:space="preserve">;</w:t>
       </w:r>
     </w:p>
     <w:p>
@@ -399,6 +451,24 @@
           <w:lang w:val="vi-VN"/>
         </w:rPr>
       </w:pPr>
+      <w:sdt>
+        <w:sdtPr>
+          <w:alias w:val="ORGANIZER"/>
+          <w:tag w:val="ORGANIZER"/>
+          <w:id w:val="913006"/>
+        </w:sdtPr>
+        <w:sdtContent>
+          <w:r>
+            <w:rPr>
+              <w:bCs/>
+              <w:sz w:val="28"/>
+              <w:szCs w:val="28"/>
+              <w:lang w:val="vi-VN"/>
+            </w:rPr>
+            <w:t xml:space="preserve">Tập thể lãnh đạo, quản lý… (ghi tên Phòng/Trung tâm, Ban/Đơn vị) hoặc Đảng ủy/Chi ủy cơ sở… (ghi tên đảng ủy/chi ủy cơ sở)</w:t>
+          </w:r>
+        </w:sdtContent>
+      </w:sdt>
       <w:r>
         <w:rPr>
           <w:bCs/>
@@ -406,7 +476,34 @@
           <w:szCs w:val="28"/>
           <w:lang w:val="vi-VN"/>
         </w:rPr>
-        <w:t xml:space="preserve">Tập thể lãnh đạo, quản lý… (ghi tên Phòng/Trung tâm, Ban/Đơn vị) hoặc Đảng ủy/Chi ủy cơ sở… (ghi tên đảng ủy/chi ủy cơ sở) đã tổ chức Hội nghị để nhận xét, đánh giá, bỏ phiếu đề xuất mức xếp loại (hoặc bỏ phiếu quyết định, phê duyệt mức xếp loại) chất </w:t>
+        <w:t xml:space="preserve"> đã tổ chức Hội nghị để </w:t>
+      </w:r>
+      <w:sdt>
+        <w:sdtPr>
+          <w:alias w:val="PURPOSE"/>
+          <w:tag w:val="PURPOSE"/>
+          <w:id w:val="913007"/>
+        </w:sdtPr>
+        <w:sdtContent>
+          <w:r>
+            <w:rPr>
+              <w:bCs/>
+              <w:sz w:val="28"/>
+              <w:szCs w:val="28"/>
+              <w:lang w:val="vi-VN"/>
+            </w:rPr>
+            <w:t xml:space="preserve">nhận xét, đánh giá, bỏ phiếu đề xuất mức xếp loại (hoặc bỏ phiếu quyết định, phê duyệt mức xếp loại)</w:t>
+          </w:r>
+        </w:sdtContent>
+      </w:sdt>
+      <w:r>
+        <w:rPr>
+          <w:bCs/>
+          <w:sz w:val="28"/>
+          <w:szCs w:val="28"/>
+          <w:lang w:val="vi-VN"/>
+        </w:rPr>
+        <w:t xml:space="preserve"> chất </w:t>
       </w:r>
       <w:r>
         <w:rPr>
@@ -414,7 +511,32 @@
           <w:szCs w:val="28"/>
           <w:lang w:val="vi-VN"/>
         </w:rPr>
-        <w:t>lượng cán bộ quý.... Cụ thể như sau:</w:t>
+        <w:t xml:space="preserve">lượng cán bộ quý</w:t>
+      </w:r>
+      <w:sdt>
+        <w:sdtPr>
+          <w:alias w:val="PERIOD_TEXT"/>
+          <w:tag w:val="PERIOD_TEXT"/>
+          <w:id w:val="913008"/>
+        </w:sdtPr>
+        <w:sdtContent>
+          <w:r>
+            <w:rPr>
+              <w:sz w:val="28"/>
+              <w:szCs w:val="28"/>
+              <w:lang w:val="vi-VN"/>
+            </w:rPr>
+            <w:t xml:space="preserve">...</w:t>
+          </w:r>
+        </w:sdtContent>
+      </w:sdt>
+      <w:r>
+        <w:rPr>
+          <w:sz w:val="28"/>
+          <w:szCs w:val="28"/>
+          <w:lang w:val="vi-VN"/>
+        </w:rPr>
+        <w:t xml:space="preserve">. Cụ thể như sau:</w:t>
       </w:r>
     </w:p>
     <w:p>
@@ -459,15 +581,54 @@
           <w:sz w:val="28"/>
           <w:szCs w:val="28"/>
         </w:rPr>
-        <w:t>1. Thời gian:</w:t>
+        <w:t xml:space="preserve">1. Thời gian:</w:t>
       </w:r>
       <w:r>
         <w:rPr>
           <w:sz w:val="28"/>
           <w:szCs w:val="28"/>
         </w:rPr>
-        <w:t xml:space="preserve"> Bắt đầu vào hồi …..h..…, ngày ..…/…../..……..</w:t>
+        <w:t xml:space="preserve"> Bắt đầu vào hồi </w:t>
       </w:r>
+      <w:sdt>
+        <w:sdtPr>
+          <w:alias w:val="START_TIME"/>
+          <w:tag w:val="START_TIME"/>
+          <w:id w:val="913009"/>
+        </w:sdtPr>
+        <w:sdtContent>
+          <w:r>
+            <w:rPr>
+              <w:sz w:val="28"/>
+              <w:szCs w:val="28"/>
+            </w:rPr>
+            <w:t xml:space="preserve">…..h..…</w:t>
+          </w:r>
+        </w:sdtContent>
+      </w:sdt>
+      <w:r>
+        <w:rPr>
+          <w:sz w:val="28"/>
+          <w:szCs w:val="28"/>
+        </w:rPr>
+        <w:t xml:space="preserve">, ngày </w:t>
+      </w:r>
+      <w:sdt>
+        <w:sdtPr>
+          <w:alias w:val="START_DATE"/>
+          <w:tag w:val="START_DATE"/>
+          <w:id w:val="913010"/>
+        </w:sdtPr>
+        <w:sdtContent>
+          <w:r>
+            <w:rPr>
+              <w:sz w:val="28"/>
+              <w:szCs w:val="28"/>
+            </w:rPr>
+            <w:t xml:space="preserve">..…/…../..……..</w:t>
+          </w:r>
+        </w:sdtContent>
+      </w:sdt>
     </w:p>
     <w:p>
       <w:pPr>
@@ -485,15 +646,31 @@
           <w:sz w:val="28"/>
           <w:szCs w:val="28"/>
         </w:rPr>
-        <w:t>2. Địa điểm:</w:t>
+        <w:t xml:space="preserve">2. Địa điểm:</w:t>
       </w:r>
       <w:r>
         <w:rPr>
           <w:sz w:val="28"/>
           <w:szCs w:val="28"/>
         </w:rPr>
-        <w:t> ………………….</w:t>
+        <w:t xml:space="preserve"> </w:t>
       </w:r>
+      <w:sdt>
+        <w:sdtPr>
+          <w:alias w:val="LOCATION"/>
+          <w:tag w:val="LOCATION"/>
+          <w:id w:val="913011"/>
+        </w:sdtPr>
+        <w:sdtContent>
+          <w:r>
+            <w:rPr>
+              <w:sz w:val="28"/>
+              <w:szCs w:val="28"/>
+            </w:rPr>
+            <w:t xml:space="preserve">………………….</w:t>
+          </w:r>
+        </w:sdtContent>
+      </w:sdt>
     </w:p>
     <w:p>
       <w:pPr>
@@ -553,14 +730,30 @@
           <w:szCs w:val="28"/>
         </w:rPr>
         <w:t xml:space="preserve">- Tổng số triệu tập: </w:t>
+        <w:tab/>
       </w:r>
+      <w:sdt>
+        <w:sdtPr>
+          <w:alias w:val="INVITED"/>
+          <w:tag w:val="INVITED"/>
+          <w:id w:val="913012"/>
+        </w:sdtPr>
+        <w:sdtContent>
+          <w:r>
+            <w:rPr>
+              <w:sz w:val="28"/>
+              <w:szCs w:val="28"/>
+            </w:rPr>
+            <w:t xml:space="preserve">…..</w:t>
+          </w:r>
+        </w:sdtContent>
+      </w:sdt>
       <w:r>
         <w:rPr>
           <w:sz w:val="28"/>
           <w:szCs w:val="28"/>
         </w:rPr>
-        <w:tab/>
-        <w:t>….. đồng chí.</w:t>
+        <w:t xml:space="preserve"> đồng chí.</w:t>
       </w:r>
     </w:p>
     <w:p>
@@ -581,14 +774,30 @@
           <w:szCs w:val="28"/>
         </w:rPr>
         <w:t xml:space="preserve">- Số có mặt: </w:t>
+        <w:tab/>
       </w:r>
+      <w:sdt>
+        <w:sdtPr>
+          <w:alias w:val="PRESENT"/>
+          <w:tag w:val="PRESENT"/>
+          <w:id w:val="913013"/>
+        </w:sdtPr>
+        <w:sdtContent>
+          <w:r>
+            <w:rPr>
+              <w:sz w:val="28"/>
+              <w:szCs w:val="28"/>
+            </w:rPr>
+            <w:t xml:space="preserve">…..</w:t>
+          </w:r>
+        </w:sdtContent>
+      </w:sdt>
       <w:r>
         <w:rPr>
           <w:sz w:val="28"/>
           <w:szCs w:val="28"/>
         </w:rPr>
-        <w:tab/>
-        <w:t>….. đồng chí.</w:t>
+        <w:t xml:space="preserve"> đồng chí.</w:t>
       </w:r>
     </w:p>
     <w:p>
@@ -609,14 +818,30 @@
           <w:szCs w:val="28"/>
         </w:rPr>
         <w:t xml:space="preserve">- Số vắng mặt: </w:t>
+        <w:tab/>
       </w:r>
+      <w:sdt>
+        <w:sdtPr>
+          <w:alias w:val="ABSENT"/>
+          <w:tag w:val="ABSENT"/>
+          <w:id w:val="913014"/>
+        </w:sdtPr>
+        <w:sdtContent>
+          <w:r>
+            <w:rPr>
+              <w:sz w:val="28"/>
+              <w:szCs w:val="28"/>
+            </w:rPr>
+            <w:t xml:space="preserve">…..</w:t>
+          </w:r>
+        </w:sdtContent>
+      </w:sdt>
       <w:r>
         <w:rPr>
           <w:sz w:val="28"/>
           <w:szCs w:val="28"/>
         </w:rPr>
-        <w:tab/>
-        <w:t>….. đồng chí (có lý do).</w:t>
+        <w:t xml:space="preserve"> đồng chí (có lý do).</w:t>
       </w:r>
     </w:p>
     <w:p>
@@ -641,60 +866,133 @@
         <w:t>3.2. Một số cán bộ, đảng viên khác được cử tham dự Hội nghị để ghi chép, báo cáo và phục vụ Hội nghị</w:t>
       </w:r>
     </w:p>
-    <w:p>
-      <w:pPr>
-        <w:spacing w:before="120"/>
-        <w:ind w:firstLine="709"/>
-        <w:rPr>
-          <w:b/>
-          <w:bCs/>
-          <w:sz w:val="28"/>
-          <w:szCs w:val="28"/>
-        </w:rPr>
-      </w:pPr>
-      <w:r>
-        <w:rPr>
-          <w:sz w:val="28"/>
-          <w:szCs w:val="28"/>
-        </w:rPr>
-        <w:t xml:space="preserve">(1) Đồng chí </w:t>
-      </w:r>
-      <w:r>
-        <w:rPr>
-          <w:b/>
-          <w:bCs/>
-          <w:sz w:val="28"/>
-          <w:szCs w:val="28"/>
-        </w:rPr>
-        <w:t>…</w:t>
-      </w:r>
-      <w:r>
-        <w:rPr>
-          <w:sz w:val="28"/>
-          <w:szCs w:val="28"/>
-        </w:rPr>
-        <w:t xml:space="preserve"> -… (ghi rõ chức vụ Đảng, chính quyền).</w:t>
-      </w:r>
-    </w:p>
-    <w:p>
-      <w:pPr>
-        <w:spacing w:before="120"/>
-        <w:ind w:firstLine="709"/>
-        <w:rPr>
-          <w:b/>
-          <w:bCs/>
-          <w:sz w:val="28"/>
-          <w:szCs w:val="28"/>
-        </w:rPr>
-      </w:pPr>
-      <w:r>
-        <w:rPr>
-          <w:sz w:val="28"/>
-          <w:szCs w:val="28"/>
-        </w:rPr>
-        <w:t>…</w:t>
-      </w:r>
-    </w:p>
+    <w:sdt>
+      <w:sdtPr>
+        <w:alias w:val="repeat:ATTENDEES"/>
+        <w:tag w:val="repeat:ATTENDEES"/>
+        <w:id w:val="913018"/>
+      </w:sdtPr>
+      <w:sdtContent>
+        <w:p>
+          <w:pPr>
+            <w:spacing w:before="120"/>
+            <w:ind w:firstLine="709"/>
+            <w:rPr>
+              <w:b/>
+              <w:bCs/>
+              <w:sz w:val="28"/>
+              <w:szCs w:val="28"/>
+            </w:rPr>
+          </w:pPr>
+          <w:r>
+            <w:rPr>
+              <w:sz w:val="28"/>
+              <w:szCs w:val="28"/>
+            </w:rPr>
+            <w:t xml:space="preserve">(</w:t>
+          </w:r>
+          <w:sdt>
+            <w:sdtPr>
+              <w:alias w:val="A_STT"/>
+              <w:tag w:val="A_STT"/>
+              <w:id w:val="913015"/>
+            </w:sdtPr>
+            <w:sdtContent>
+              <w:r>
+                <w:rPr>
+                  <w:sz w:val="28"/>
+                  <w:szCs w:val="28"/>
+                </w:rPr>
+                <w:t xml:space="preserve">1</w:t>
+              </w:r>
+            </w:sdtContent>
+          </w:sdt>
+          <w:r>
+            <w:rPr>
+              <w:sz w:val="28"/>
+              <w:szCs w:val="28"/>
+            </w:rPr>
+            <w:t xml:space="preserve">) Đồng chí </w:t>
+          </w:r>
+          <w:sdt>
+            <w:sdtPr>
+              <w:alias w:val="A_NAME"/>
+              <w:tag w:val="A_NAME"/>
+              <w:id w:val="913016"/>
+            </w:sdtPr>
+            <w:sdtContent>
+              <w:r>
+                <w:rPr>
+                  <w:b/>
+                  <w:bCs/>
+                  <w:sz w:val="28"/>
+                  <w:szCs w:val="28"/>
+                </w:rPr>
+                <w:t xml:space="preserve">…</w:t>
+              </w:r>
+            </w:sdtContent>
+          </w:sdt>
+          <w:r>
+            <w:rPr>
+              <w:sz w:val="28"/>
+              <w:szCs w:val="28"/>
+            </w:rPr>
+            <w:t xml:space="preserve"> -</w:t>
+          </w:r>
+          <w:sdt>
+            <w:sdtPr>
+              <w:alias w:val="A_TITLE"/>
+              <w:tag w:val="A_TITLE"/>
+              <w:id w:val="913017"/>
+            </w:sdtPr>
+            <w:sdtContent>
+              <w:r>
+                <w:rPr>
+                  <w:sz w:val="28"/>
+                  <w:szCs w:val="28"/>
+                </w:rPr>
+                <w:t xml:space="preserve">… (ghi rõ chức vụ Đảng, chính quyền)</w:t>
+              </w:r>
+            </w:sdtContent>
+          </w:sdt>
+          <w:r>
+            <w:rPr>
+              <w:sz w:val="28"/>
+              <w:szCs w:val="28"/>
+            </w:rPr>
+            <w:t xml:space="preserve">.</w:t>
+          </w:r>
+        </w:p>
+      </w:sdtContent>
+    </w:sdt>
+    <w:sdt>
+      <w:sdtPr>
+        <w:alias w:val="ifnot:HAS_ATTENDEES"/>
+        <w:tag w:val="ifnot:HAS_ATTENDEES"/>
+        <w:id w:val="913019"/>
+      </w:sdtPr>
+      <w:sdtContent>
+        <w:p>
+          <w:pPr>
+            <w:spacing w:before="120"/>
+            <w:ind w:firstLine="709"/>
+            <w:rPr>
+              <w:b/>
+              <w:bCs/>
+              <w:sz w:val="28"/>
+              <w:szCs w:val="28"/>
+            </w:rPr>
+          </w:pPr>
+          <w:r>
+            <w:rPr>
+              <w:sz w:val="28"/>
+              <w:szCs w:val="28"/>
+            </w:rPr>
+            <w:t>…</w:t>
+          </w:r>
+        </w:p>
+      </w:sdtContent>
+    </w:sdt>
     <w:p>
       <w:pPr>
         <w:spacing w:before="120"/>
@@ -722,21 +1020,53 @@
         </w:rPr>
         <w:t xml:space="preserve">Đồng chí </w:t>
       </w:r>
-      <w:r>
-        <w:rPr>
-          <w:b/>
-          <w:bCs/>
-          <w:sz w:val="28"/>
-          <w:szCs w:val="28"/>
-        </w:rPr>
-        <w:t>…</w:t>
-      </w:r>
+      <w:sdt>
+        <w:sdtPr>
+          <w:alias w:val="CHAIR_NAME"/>
+          <w:tag w:val="CHAIR_NAME"/>
+          <w:id w:val="913020"/>
+        </w:sdtPr>
+        <w:sdtContent>
+          <w:r>
+            <w:rPr>
+              <w:b/>
+              <w:bCs/>
+              <w:sz w:val="28"/>
+              <w:szCs w:val="28"/>
+            </w:rPr>
+            <w:t xml:space="preserve">…</w:t>
+          </w:r>
+        </w:sdtContent>
+      </w:sdt>
       <w:r>
         <w:rPr>
           <w:sz w:val="28"/>
           <w:szCs w:val="28"/>
         </w:rPr>
-        <w:t xml:space="preserve"> -… (ghi rõ chức vụ Đảng, chính quyền).</w:t>
+        <w:t xml:space="preserve"> -</w:t>
+      </w:r>
+      <w:sdt>
+        <w:sdtPr>
+          <w:alias w:val="CHAIR_TITLE"/>
+          <w:tag w:val="CHAIR_TITLE"/>
+          <w:id w:val="913021"/>
+        </w:sdtPr>
+        <w:sdtContent>
+          <w:r>
+            <w:rPr>
+              <w:sz w:val="28"/>
+              <w:szCs w:val="28"/>
+            </w:rPr>
+            <w:t xml:space="preserve">… (ghi rõ chức vụ Đảng, chính quyền)</w:t>
+          </w:r>
+        </w:sdtContent>
+      </w:sdt>
+      <w:r>
+        <w:rPr>
+          <w:sz w:val="28"/>
+          <w:szCs w:val="28"/>
+        </w:rPr>
+        <w:t xml:space="preserve">.</w:t>
       </w:r>
     </w:p>
     <w:p>
@@ -757,7 +1087,7 @@
           <w:sz w:val="28"/>
           <w:szCs w:val="28"/>
         </w:rPr>
-        <w:t>5. Thư ký Hội nghị:</w:t>
+        <w:t xml:space="preserve">5. Thư ký Hội nghị:</w:t>
       </w:r>
       <w:r>
         <w:rPr>
@@ -766,21 +1096,53 @@
         </w:rPr>
         <w:t xml:space="preserve"> Đồng chí </w:t>
       </w:r>
-      <w:r>
-        <w:rPr>
-          <w:b/>
-          <w:bCs/>
-          <w:sz w:val="28"/>
-          <w:szCs w:val="28"/>
-        </w:rPr>
-        <w:t>…</w:t>
-      </w:r>
+      <w:sdt>
+        <w:sdtPr>
+          <w:alias w:val="SECRETARY_NAME"/>
+          <w:tag w:val="SECRETARY_NAME"/>
+          <w:id w:val="913022"/>
+        </w:sdtPr>
+        <w:sdtContent>
+          <w:r>
+            <w:rPr>
+              <w:b/>
+              <w:bCs/>
+              <w:sz w:val="28"/>
+              <w:szCs w:val="28"/>
+            </w:rPr>
+            <w:t xml:space="preserve">…</w:t>
+          </w:r>
+        </w:sdtContent>
+      </w:sdt>
       <w:r>
         <w:rPr>
           <w:sz w:val="28"/>
           <w:szCs w:val="28"/>
         </w:rPr>
-        <w:t xml:space="preserve"> -… (ghi rõ chức vụ Đảng, chính quyền).</w:t>
+        <w:t xml:space="preserve"> -</w:t>
+      </w:r>
+      <w:sdt>
+        <w:sdtPr>
+          <w:alias w:val="SECRETARY_TITLE"/>
+          <w:tag w:val="SECRETARY_TITLE"/>
+          <w:id w:val="913023"/>
+        </w:sdtPr>
+        <w:sdtContent>
+          <w:r>
+            <w:rPr>
+              <w:sz w:val="28"/>
+              <w:szCs w:val="28"/>
+            </w:rPr>
+            <w:t xml:space="preserve">… (ghi rõ chức vụ Đảng, chính quyền)</w:t>
+          </w:r>
+        </w:sdtContent>
+      </w:sdt>
+      <w:r>
+        <w:rPr>
+          <w:sz w:val="28"/>
+          <w:szCs w:val="28"/>
+        </w:rPr>
+        <w:t xml:space="preserve">.</w:t>
       </w:r>
     </w:p>
     <w:p>
@@ -818,13 +1180,13 @@
           <w:sz w:val="28"/>
           <w:szCs w:val="28"/>
         </w:rPr>
-        <w:t xml:space="preserve">Sau khi nghe báo cáo về tình hình thực hiện nhiệm vụ trọng tâm </w:t>
+        <w:t xml:space="preserve">Sau khi nghe báo cáo về tình hình thực hiện nhiệm vụ trọng tâm quý</w:t>
       </w:r>
       <w:sdt>
         <w:sdtPr>
-          <w:alias w:val="PERIOD_QUARTER_YEAR"/>
-          <w:tag w:val="PERIOD_QUARTER_YEAR"/>
-          <w:id w:val="510067"/>
+          <w:alias w:val="PERIOD_TEXT"/>
+          <w:tag w:val="PERIOD_TEXT"/>
+          <w:id w:val="913024"/>
         </w:sdtPr>
         <w:sdtContent>
           <w:r>
@@ -832,7 +1194,7 @@
               <w:sz w:val="28"/>
               <w:szCs w:val="28"/>
             </w:rPr>
-            <w:t xml:space="preserve">«PERIOD_QUARTER_YEAR»</w:t>
+            <w:t xml:space="preserve">…</w:t>
           </w:r>
         </w:sdtContent>
       </w:sdt>
@@ -841,13 +1203,13 @@
           <w:sz w:val="28"/>
           <w:szCs w:val="28"/>
         </w:rPr>
-        <w:t xml:space="preserve"> của… (ghi tên cơ quan, đơn vị, tổ chức) và các thông tin có liên quan đến việc đánh giá, xếp loại chất lượng cán bộ </w:t>
+        <w:t xml:space="preserve"> của</w:t>
       </w:r>
       <w:sdt>
         <w:sdtPr>
-          <w:alias w:val="PERIOD_QUARTER_YEAR"/>
-          <w:tag w:val="PERIOD_QUARTER_YEAR"/>
-          <w:id w:val="510068"/>
+          <w:alias w:val="REPORTING_UNIT"/>
+          <w:tag w:val="REPORTING_UNIT"/>
+          <w:id w:val="913025"/>
         </w:sdtPr>
         <w:sdtContent>
           <w:r>
@@ -855,7 +1217,7 @@
               <w:sz w:val="28"/>
               <w:szCs w:val="28"/>
             </w:rPr>
-            <w:t xml:space="preserve">«PERIOD_QUARTER_YEAR»</w:t>
+            <w:t xml:space="preserve">… (ghi tên cơ quan, đơn vị, tổ chức)</w:t>
           </w:r>
         </w:sdtContent>
       </w:sdt>
@@ -864,13 +1226,13 @@
           <w:sz w:val="28"/>
           <w:szCs w:val="28"/>
         </w:rPr>
-        <w:t xml:space="preserve"> (kết quả tự đánh giá/xếp loại của cá nhân, ý kiến đề xuất của các cấp và các thông tin liên quan khác), Hội nghị đã thảo luận, đánh giá và bỏ phiếu kín đề xuất mức xếp loại (hoặc bỏ phiếu kín quyết định, phê duyệt mức xếp loại) chất lượng cán bộ </w:t>
+        <w:t xml:space="preserve"> và các thông tin có liên quan đến việc đánh giá, xếp loại chất lượng cán bộ quý</w:t>
       </w:r>
       <w:sdt>
         <w:sdtPr>
-          <w:alias w:val="PERIOD_QUARTER_YEAR"/>
-          <w:tag w:val="PERIOD_QUARTER_YEAR"/>
-          <w:id w:val="510069"/>
+          <w:alias w:val="PERIOD_TEXT"/>
+          <w:tag w:val="PERIOD_TEXT"/>
+          <w:id w:val="913026"/>
         </w:sdtPr>
         <w:sdtContent>
           <w:r>
@@ -878,7 +1240,53 @@
               <w:sz w:val="28"/>
               <w:szCs w:val="28"/>
             </w:rPr>
-            <w:t xml:space="preserve">«PERIOD_QUARTER_YEAR»</w:t>
+            <w:t xml:space="preserve">…</w:t>
+          </w:r>
+        </w:sdtContent>
+      </w:sdt>
+      <w:r>
+        <w:rPr>
+          <w:sz w:val="28"/>
+          <w:szCs w:val="28"/>
+        </w:rPr>
+        <w:t xml:space="preserve"> (kết quả tự đánh giá/xếp loại của cá nhân, ý kiến đề xuất của các cấp và các thông tin liên quan khác), Hội nghị đã thảo luận, đánh giá và bỏ phiếu kín </w:t>
+      </w:r>
+      <w:sdt>
+        <w:sdtPr>
+          <w:alias w:val="VOTE_PURPOSE"/>
+          <w:tag w:val="VOTE_PURPOSE"/>
+          <w:id w:val="913027"/>
+        </w:sdtPr>
+        <w:sdtContent>
+          <w:r>
+            <w:rPr>
+              <w:sz w:val="28"/>
+              <w:szCs w:val="28"/>
+            </w:rPr>
+            <w:t xml:space="preserve">đề xuất mức xếp loại (hoặc bỏ phiếu kín quyết định, phê duyệt mức xếp loại)</w:t>
+          </w:r>
+        </w:sdtContent>
+      </w:sdt>
+      <w:r>
+        <w:rPr>
+          <w:sz w:val="28"/>
+          <w:szCs w:val="28"/>
+        </w:rPr>
+        <w:t xml:space="preserve"> chất lượng cán bộ quý</w:t>
+      </w:r>
+      <w:sdt>
+        <w:sdtPr>
+          <w:alias w:val="PERIOD_TEXT"/>
+          <w:tag w:val="PERIOD_TEXT"/>
+          <w:id w:val="913028"/>
+        </w:sdtPr>
+        <w:sdtContent>
+          <w:r>
+            <w:rPr>
+              <w:sz w:val="28"/>
+              <w:szCs w:val="28"/>
+            </w:rPr>
+            <w:t xml:space="preserve">…</w:t>
           </w:r>
         </w:sdtContent>
       </w:sdt>
@@ -910,66 +1318,196 @@
         <w:t xml:space="preserve">- Hội nghị đã bầu Tổ kiểm phiếu gồm các đồng chí: </w:t>
       </w:r>
     </w:p>
-    <w:p>
-      <w:pPr>
-        <w:tabs>
-          <w:tab w:val="left" w:pos="3150"/>
-        </w:tabs>
-        <w:spacing w:after="0" w:line="240" w:lineRule="auto"/>
-        <w:ind w:firstLine="709"/>
-        <w:rPr>
-          <w:sz w:val="28"/>
-          <w:szCs w:val="28"/>
-        </w:rPr>
-      </w:pPr>
-      <w:r>
-        <w:rPr>
-          <w:sz w:val="28"/>
-          <w:szCs w:val="28"/>
-        </w:rPr>
-        <w:t>(1) Đồng chí … -… (ghi rõ chức vụ Đảng, chính quyền): Tổ trưởng.</w:t>
-      </w:r>
-    </w:p>
-    <w:p>
-      <w:pPr>
-        <w:tabs>
-          <w:tab w:val="left" w:pos="3150"/>
-        </w:tabs>
-        <w:spacing w:after="0" w:line="240" w:lineRule="auto"/>
-        <w:ind w:firstLine="709"/>
-        <w:rPr>
-          <w:sz w:val="28"/>
-          <w:szCs w:val="28"/>
-        </w:rPr>
-      </w:pPr>
-      <w:r>
-        <w:rPr>
-          <w:sz w:val="28"/>
-          <w:szCs w:val="28"/>
-        </w:rPr>
-        <w:t>(2) Đồng chí … -… (ghi rõ chức vụ Đảng, chính quyền): Thành viên.</w:t>
-      </w:r>
-    </w:p>
-    <w:p>
-      <w:pPr>
-        <w:tabs>
-          <w:tab w:val="left" w:pos="3150"/>
-        </w:tabs>
-        <w:spacing w:after="0" w:line="240" w:lineRule="auto"/>
-        <w:ind w:firstLine="709"/>
-        <w:rPr>
-          <w:sz w:val="28"/>
-          <w:szCs w:val="28"/>
-        </w:rPr>
-      </w:pPr>
-      <w:r>
-        <w:rPr>
-          <w:sz w:val="28"/>
-          <w:szCs w:val="28"/>
-        </w:rPr>
-        <w:t>…</w:t>
-      </w:r>
-    </w:p>
+    <w:sdt>
+      <w:sdtPr>
+        <w:alias w:val="repeat:COUNTERS"/>
+        <w:tag w:val="repeat:COUNTERS"/>
+        <w:id w:val="913033"/>
+      </w:sdtPr>
+      <w:sdtContent>
+        <w:p>
+          <w:pPr>
+            <w:tabs>
+              <w:tab w:val="left" w:pos="3150"/>
+            </w:tabs>
+            <w:spacing w:after="0" w:line="240" w:lineRule="auto"/>
+            <w:ind w:firstLine="709"/>
+            <w:rPr>
+              <w:sz w:val="28"/>
+              <w:szCs w:val="28"/>
+            </w:rPr>
+          </w:pPr>
+          <w:r>
+            <w:rPr>
+              <w:sz w:val="28"/>
+              <w:szCs w:val="28"/>
+            </w:rPr>
+            <w:t xml:space="preserve">(</w:t>
+          </w:r>
+          <w:sdt>
+            <w:sdtPr>
+              <w:alias w:val="C_STT"/>
+              <w:tag w:val="C_STT"/>
+              <w:id w:val="913029"/>
+            </w:sdtPr>
+            <w:sdtContent>
+              <w:r>
+                <w:rPr>
+                  <w:sz w:val="28"/>
+                  <w:szCs w:val="28"/>
+                </w:rPr>
+                <w:t xml:space="preserve">1</w:t>
+              </w:r>
+            </w:sdtContent>
+          </w:sdt>
+          <w:r>
+            <w:rPr>
+              <w:sz w:val="28"/>
+              <w:szCs w:val="28"/>
+            </w:rPr>
+            <w:t xml:space="preserve">) Đồng chí </w:t>
+          </w:r>
+          <w:sdt>
+            <w:sdtPr>
+              <w:alias w:val="C_NAME"/>
+              <w:tag w:val="C_NAME"/>
+              <w:id w:val="913030"/>
+            </w:sdtPr>
+            <w:sdtContent>
+              <w:r>
+                <w:rPr>
+                  <w:sz w:val="28"/>
+                  <w:szCs w:val="28"/>
+                </w:rPr>
+                <w:t xml:space="preserve">…</w:t>
+              </w:r>
+            </w:sdtContent>
+          </w:sdt>
+          <w:r>
+            <w:rPr>
+              <w:sz w:val="28"/>
+              <w:szCs w:val="28"/>
+            </w:rPr>
+            <w:t xml:space="preserve"> -</w:t>
+          </w:r>
+          <w:sdt>
+            <w:sdtPr>
+              <w:alias w:val="C_TITLE"/>
+              <w:tag w:val="C_TITLE"/>
+              <w:id w:val="913031"/>
+            </w:sdtPr>
+            <w:sdtContent>
+              <w:r>
+                <w:rPr>
+                  <w:sz w:val="28"/>
+                  <w:szCs w:val="28"/>
+                </w:rPr>
+                <w:t xml:space="preserve">… (ghi rõ chức vụ Đảng, chính quyền)</w:t>
+              </w:r>
+            </w:sdtContent>
+          </w:sdt>
+          <w:r>
+            <w:rPr>
+              <w:sz w:val="28"/>
+              <w:szCs w:val="28"/>
+            </w:rPr>
+            <w:t xml:space="preserve">: </w:t>
+          </w:r>
+          <w:sdt>
+            <w:sdtPr>
+              <w:alias w:val="C_ROLE"/>
+              <w:tag w:val="C_ROLE"/>
+              <w:id w:val="913032"/>
+            </w:sdtPr>
+            <w:sdtContent>
+              <w:r>
+                <w:rPr>
+                  <w:sz w:val="28"/>
+                  <w:szCs w:val="28"/>
+                </w:rPr>
+                <w:t xml:space="preserve">Tổ trưởng</w:t>
+              </w:r>
+            </w:sdtContent>
+          </w:sdt>
+          <w:r>
+            <w:rPr>
+              <w:sz w:val="28"/>
+              <w:szCs w:val="28"/>
+            </w:rPr>
+            <w:t xml:space="preserve">.</w:t>
+          </w:r>
+        </w:p>
+      </w:sdtContent>
+    </w:sdt>
+    <w:sdt>
+      <w:sdtPr>
+        <w:alias w:val="ifnot:HAS_COUNTERS"/>
+        <w:tag w:val="ifnot:HAS_COUNTERS"/>
+        <w:id w:val="913034"/>
+      </w:sdtPr>
+      <w:sdtContent>
+        <w:p>
+          <w:pPr>
+            <w:tabs>
+              <w:tab w:val="left" w:pos="3150"/>
+            </w:tabs>
+            <w:spacing w:after="0" w:line="240" w:lineRule="auto"/>
+            <w:ind w:firstLine="709"/>
+            <w:rPr>
+              <w:sz w:val="28"/>
+              <w:szCs w:val="28"/>
+            </w:rPr>
+          </w:pPr>
+          <w:r>
+            <w:rPr>
+              <w:sz w:val="28"/>
+              <w:szCs w:val="28"/>
+            </w:rPr>
+            <w:t>(1) Đồng chí … -… (ghi rõ chức vụ Đảng, chính quyền): Tổ trưởng.</w:t>
+          </w:r>
+        </w:p>
+        <w:p>
+          <w:pPr>
+            <w:tabs>
+              <w:tab w:val="left" w:pos="3150"/>
+            </w:tabs>
+            <w:spacing w:after="0" w:line="240" w:lineRule="auto"/>
+            <w:ind w:firstLine="709"/>
+            <w:rPr>
+              <w:sz w:val="28"/>
+              <w:szCs w:val="28"/>
+            </w:rPr>
+          </w:pPr>
+          <w:r>
+            <w:rPr>
+              <w:sz w:val="28"/>
+              <w:szCs w:val="28"/>
+            </w:rPr>
+            <w:t>(2) Đồng chí … -… (ghi rõ chức vụ Đảng, chính quyền): Thành viên.</w:t>
+          </w:r>
+        </w:p>
+        <w:p>
+          <w:pPr>
+            <w:tabs>
+              <w:tab w:val="left" w:pos="3150"/>
+            </w:tabs>
+            <w:spacing w:after="0" w:line="240" w:lineRule="auto"/>
+            <w:ind w:firstLine="709"/>
+            <w:rPr>
+              <w:sz w:val="28"/>
+              <w:szCs w:val="28"/>
+            </w:rPr>
+          </w:pPr>
+          <w:r>
+            <w:rPr>
+              <w:sz w:val="28"/>
+              <w:szCs w:val="28"/>
+            </w:rPr>
+            <w:t>…</w:t>
+          </w:r>
+        </w:p>
+      </w:sdtContent>
+    </w:sdt>
     <w:p>
       <w:pPr>
         <w:tabs>
@@ -991,22 +1529,14 @@
           <w:sz w:val="28"/>
           <w:szCs w:val="28"/>
         </w:rPr>
-        <w:t>- Tổng số phiếu phát ra:</w:t>
-      </w:r>
-      <w:r>
-        <w:rPr>
-          <w:i/>
-          <w:iCs/>
-          <w:sz w:val="28"/>
-          <w:szCs w:val="28"/>
-        </w:rPr>
+        <w:t xml:space="preserve">- Tổng số phiếu phát ra:</w:t>
         <w:tab/>
       </w:r>
       <w:sdt>
         <w:sdtPr>
-          <w:alias w:val="TOTAL_VOTERS"/>
-          <w:tag w:val="TOTAL_VOTERS"/>
-          <w:id w:val="510070"/>
+          <w:alias w:val="BALLOTS_ISSUED"/>
+          <w:tag w:val="BALLOTS_ISSUED"/>
+          <w:id w:val="913035"/>
         </w:sdtPr>
         <w:sdtContent>
           <w:r>
@@ -1051,22 +1581,14 @@
           <w:sz w:val="28"/>
           <w:szCs w:val="28"/>
         </w:rPr>
-        <w:t>- Tổng số phiếu thu về:</w:t>
-      </w:r>
-      <w:r>
-        <w:rPr>
-          <w:i/>
-          <w:iCs/>
-          <w:sz w:val="28"/>
-          <w:szCs w:val="28"/>
-        </w:rPr>
+        <w:t xml:space="preserve">- Tổng số phiếu thu về:</w:t>
         <w:tab/>
       </w:r>
       <w:sdt>
         <w:sdtPr>
-          <w:alias w:val="TOTAL_VOTERS"/>
-          <w:tag w:val="TOTAL_VOTERS"/>
-          <w:id w:val="510071"/>
+          <w:alias w:val="BALLOTS_COLLECTED"/>
+          <w:tag w:val="BALLOTS_COLLECTED"/>
+          <w:id w:val="913036"/>
         </w:sdtPr>
         <w:sdtContent>
           <w:r>
@@ -1111,22 +1633,14 @@
           <w:sz w:val="28"/>
           <w:szCs w:val="28"/>
         </w:rPr>
-        <w:t>+ Số phiếu hợp lệ:</w:t>
-      </w:r>
-      <w:r>
-        <w:rPr>
-          <w:i/>
-          <w:iCs/>
-          <w:sz w:val="28"/>
-          <w:szCs w:val="28"/>
-        </w:rPr>
+        <w:t xml:space="preserve">+ Số phiếu hợp lệ:</w:t>
         <w:tab/>
       </w:r>
       <w:sdt>
         <w:sdtPr>
-          <w:alias w:val="TOTAL_VOTERS"/>
-          <w:tag w:val="TOTAL_VOTERS"/>
-          <w:id w:val="510072"/>
+          <w:alias w:val="BALLOTS_VALID"/>
+          <w:tag w:val="BALLOTS_VALID"/>
+          <w:id w:val="913037"/>
         </w:sdtPr>
         <w:sdtContent>
           <w:r>
@@ -1171,22 +1685,14 @@
           <w:sz w:val="28"/>
           <w:szCs w:val="28"/>
         </w:rPr>
-        <w:t>+ Số phiếu không hợp lệ:</w:t>
-      </w:r>
-      <w:r>
-        <w:rPr>
-          <w:i/>
-          <w:iCs/>
-          <w:sz w:val="28"/>
-          <w:szCs w:val="28"/>
-        </w:rPr>
+        <w:t xml:space="preserve">+ Số phiếu không hợp lệ:</w:t>
         <w:tab/>
       </w:r>
       <w:sdt>
         <w:sdtPr>
-          <w:alias w:val="INVALID_BALLOTS"/>
-          <w:tag w:val="INVALID_BALLOTS"/>
-          <w:id w:val="510073"/>
+          <w:alias w:val="BALLOTS_INVALID"/>
+          <w:tag w:val="BALLOTS_INVALID"/>
+          <w:id w:val="913038"/>
         </w:sdtPr>
         <w:sdtContent>
           <w:r>
@@ -1933,143 +2439,455 @@
           </w:p>
         </w:tc>
       </w:tr>
-      <w:tr>
-        <w:tc>
-          <w:tcPr>
-            <w:tcW w:w="604" w:type="dxa"/>
-          </w:tcPr>
-          <w:p>
-            <w:pPr>
-              <w:jc w:val="center"/>
-              <w:rPr>
-                <w:sz w:val="20"/>
-                <w:szCs w:val="20"/>
-                <w:lang w:val="en-US"/>
-              </w:rPr>
-            </w:pPr>
-          </w:p>
-        </w:tc>
-        <w:tc>
-          <w:tcPr>
-            <w:tcW w:w="1305" w:type="dxa"/>
-          </w:tcPr>
-          <w:p>
-            <w:pPr>
-              <w:rPr>
-                <w:sz w:val="20"/>
-                <w:szCs w:val="20"/>
-                <w:lang w:val="en-US"/>
-              </w:rPr>
-            </w:pPr>
-          </w:p>
-        </w:tc>
-        <w:tc>
-          <w:tcPr>
-            <w:tcW w:w="1347" w:type="dxa"/>
-          </w:tcPr>
-          <w:p>
-            <w:pPr>
-              <w:rPr>
-                <w:sz w:val="20"/>
-                <w:szCs w:val="20"/>
-                <w:lang w:val="en-US"/>
-              </w:rPr>
-            </w:pPr>
-          </w:p>
-        </w:tc>
-        <w:tc>
-          <w:tcPr>
-            <w:tcW w:w="1145" w:type="dxa"/>
-          </w:tcPr>
-          <w:p>
-            <w:pPr>
-              <w:jc w:val="center"/>
-              <w:rPr>
-                <w:sz w:val="20"/>
-                <w:szCs w:val="20"/>
-                <w:lang w:val="en-US"/>
-              </w:rPr>
-            </w:pPr>
-          </w:p>
-        </w:tc>
-        <w:tc>
-          <w:tcPr>
-            <w:tcW w:w="1103" w:type="dxa"/>
-          </w:tcPr>
-          <w:p>
-            <w:pPr>
-              <w:jc w:val="center"/>
-              <w:rPr>
-                <w:sz w:val="20"/>
-                <w:szCs w:val="20"/>
-                <w:lang w:val="en-US"/>
-              </w:rPr>
-            </w:pPr>
-          </w:p>
-        </w:tc>
-        <w:tc>
-          <w:tcPr>
-            <w:tcW w:w="803" w:type="dxa"/>
-          </w:tcPr>
-          <w:p>
-            <w:pPr>
-              <w:jc w:val="center"/>
-              <w:rPr>
-                <w:sz w:val="20"/>
-                <w:szCs w:val="20"/>
-                <w:lang w:val="en-US"/>
-              </w:rPr>
-            </w:pPr>
-          </w:p>
-        </w:tc>
-        <w:tc>
-          <w:tcPr>
-            <w:tcW w:w="1108" w:type="dxa"/>
-          </w:tcPr>
-          <w:p>
-            <w:pPr>
-              <w:jc w:val="center"/>
-              <w:rPr>
-                <w:sz w:val="20"/>
-                <w:szCs w:val="20"/>
-                <w:lang w:val="en-US"/>
-              </w:rPr>
-            </w:pPr>
-          </w:p>
-        </w:tc>
-        <w:tc>
-          <w:tcPr>
-            <w:tcW w:w="1085" w:type="dxa"/>
-          </w:tcPr>
-          <w:p>
-            <w:pPr>
-              <w:rPr>
-                <w:i/>
-                <w:iCs/>
-                <w:sz w:val="20"/>
-                <w:szCs w:val="20"/>
-                <w:lang w:val="en-US"/>
-              </w:rPr>
-            </w:pPr>
-          </w:p>
-        </w:tc>
-        <w:tc>
-          <w:tcPr>
-            <w:tcW w:w="1701" w:type="dxa"/>
-          </w:tcPr>
-          <w:p>
-            <w:pPr>
-              <w:rPr>
-                <w:i/>
-                <w:iCs/>
-                <w:sz w:val="20"/>
-                <w:szCs w:val="20"/>
-                <w:lang w:val="en-US"/>
-              </w:rPr>
-            </w:pPr>
-          </w:p>
-        </w:tc>
-      </w:tr>
+      <w:sdt>
+        <w:sdtPr>
+          <w:alias w:val="repeat:SUPERIOR_ROWS"/>
+          <w:tag w:val="repeat:SUPERIOR_ROWS"/>
+          <w:id w:val="913060"/>
+        </w:sdtPr>
+        <w:sdtContent>
+          <w:tr>
+            <w:tc>
+              <w:tcPr>
+                <w:tcW w:w="604" w:type="dxa"/>
+              </w:tcPr>
+              <w:p>
+                <w:pPr>
+                  <w:jc w:val="center"/>
+                  <w:rPr>
+                    <w:sz w:val="20"/>
+                    <w:szCs w:val="20"/>
+                    <w:lang w:val="en-US"/>
+                  </w:rPr>
+                </w:pPr>
+                <w:sdt>
+                  <w:sdtPr>
+                    <w:alias w:val="R_STT"/>
+                    <w:tag w:val="R_STT"/>
+                    <w:id w:val="913050"/>
+                  </w:sdtPr>
+                  <w:sdtContent>
+                    <w:r>
+                      <w:rPr>
+                        <w:sz w:val="20"/>
+                        <w:szCs w:val="20"/>
+                        <w:lang w:val="en-US"/>
+                      </w:rPr>
+                      <w:t xml:space="preserve"/>
+                    </w:r>
+                  </w:sdtContent>
+                </w:sdt>
+              </w:p>
+            </w:tc>
+            <w:tc>
+              <w:tcPr>
+                <w:tcW w:w="1305" w:type="dxa"/>
+              </w:tcPr>
+              <w:p>
+                <w:pPr>
+                  <w:rPr>
+                    <w:sz w:val="20"/>
+                    <w:szCs w:val="20"/>
+                    <w:lang w:val="en-US"/>
+                  </w:rPr>
+                </w:pPr>
+                <w:sdt>
+                  <w:sdtPr>
+                    <w:alias w:val="R_NAME"/>
+                    <w:tag w:val="R_NAME"/>
+                    <w:id w:val="913051"/>
+                  </w:sdtPr>
+                  <w:sdtContent>
+                    <w:r>
+                      <w:rPr>
+                        <w:sz w:val="20"/>
+                        <w:szCs w:val="20"/>
+                        <w:lang w:val="en-US"/>
+                      </w:rPr>
+                      <w:t xml:space="preserve"/>
+                    </w:r>
+                  </w:sdtContent>
+                </w:sdt>
+              </w:p>
+            </w:tc>
+            <w:tc>
+              <w:tcPr>
+                <w:tcW w:w="1347" w:type="dxa"/>
+              </w:tcPr>
+              <w:p>
+                <w:pPr>
+                  <w:rPr>
+                    <w:sz w:val="20"/>
+                    <w:szCs w:val="20"/>
+                    <w:lang w:val="en-US"/>
+                  </w:rPr>
+                </w:pPr>
+                <w:sdt>
+                  <w:sdtPr>
+                    <w:alias w:val="R_POSITION"/>
+                    <w:tag w:val="R_POSITION"/>
+                    <w:id w:val="913052"/>
+                  </w:sdtPr>
+                  <w:sdtContent>
+                    <w:r>
+                      <w:rPr>
+                        <w:sz w:val="20"/>
+                        <w:szCs w:val="20"/>
+                        <w:lang w:val="en-US"/>
+                      </w:rPr>
+                      <w:t xml:space="preserve"/>
+                    </w:r>
+                  </w:sdtContent>
+                </w:sdt>
+              </w:p>
+            </w:tc>
+            <w:tc>
+              <w:tcPr>
+                <w:tcW w:w="1145" w:type="dxa"/>
+              </w:tcPr>
+              <w:p>
+                <w:pPr>
+                  <w:jc w:val="center"/>
+                  <w:rPr>
+                    <w:sz w:val="20"/>
+                    <w:szCs w:val="20"/>
+                    <w:lang w:val="en-US"/>
+                  </w:rPr>
+                </w:pPr>
+                <w:sdt>
+                  <w:sdtPr>
+                    <w:alias w:val="R_EXC"/>
+                    <w:tag w:val="R_EXC"/>
+                    <w:id w:val="913053"/>
+                  </w:sdtPr>
+                  <w:sdtContent>
+                    <w:r>
+                      <w:rPr>
+                        <w:sz w:val="20"/>
+                        <w:szCs w:val="20"/>
+                        <w:lang w:val="en-US"/>
+                      </w:rPr>
+                      <w:t xml:space="preserve"/>
+                    </w:r>
+                  </w:sdtContent>
+                </w:sdt>
+              </w:p>
+            </w:tc>
+            <w:tc>
+              <w:tcPr>
+                <w:tcW w:w="1103" w:type="dxa"/>
+              </w:tcPr>
+              <w:p>
+                <w:pPr>
+                  <w:jc w:val="center"/>
+                  <w:rPr>
+                    <w:sz w:val="20"/>
+                    <w:szCs w:val="20"/>
+                    <w:lang w:val="en-US"/>
+                  </w:rPr>
+                </w:pPr>
+                <w:sdt>
+                  <w:sdtPr>
+                    <w:alias w:val="R_GOOD"/>
+                    <w:tag w:val="R_GOOD"/>
+                    <w:id w:val="913054"/>
+                  </w:sdtPr>
+                  <w:sdtContent>
+                    <w:r>
+                      <w:rPr>
+                        <w:sz w:val="20"/>
+                        <w:szCs w:val="20"/>
+                        <w:lang w:val="en-US"/>
+                      </w:rPr>
+                      <w:t xml:space="preserve"/>
+                    </w:r>
+                  </w:sdtContent>
+                </w:sdt>
+              </w:p>
+            </w:tc>
+            <w:tc>
+              <w:tcPr>
+                <w:tcW w:w="803" w:type="dxa"/>
+              </w:tcPr>
+              <w:p>
+                <w:pPr>
+                  <w:jc w:val="center"/>
+                  <w:rPr>
+                    <w:sz w:val="20"/>
+                    <w:szCs w:val="20"/>
+                    <w:lang w:val="en-US"/>
+                  </w:rPr>
+                </w:pPr>
+                <w:sdt>
+                  <w:sdtPr>
+                    <w:alias w:val="R_SAT"/>
+                    <w:tag w:val="R_SAT"/>
+                    <w:id w:val="913055"/>
+                  </w:sdtPr>
+                  <w:sdtContent>
+                    <w:r>
+                      <w:rPr>
+                        <w:sz w:val="20"/>
+                        <w:szCs w:val="20"/>
+                        <w:lang w:val="en-US"/>
+                      </w:rPr>
+                      <w:t xml:space="preserve"/>
+                    </w:r>
+                  </w:sdtContent>
+                </w:sdt>
+              </w:p>
+            </w:tc>
+            <w:tc>
+              <w:tcPr>
+                <w:tcW w:w="1108" w:type="dxa"/>
+              </w:tcPr>
+              <w:p>
+                <w:pPr>
+                  <w:jc w:val="center"/>
+                  <w:rPr>
+                    <w:sz w:val="20"/>
+                    <w:szCs w:val="20"/>
+                    <w:lang w:val="en-US"/>
+                  </w:rPr>
+                </w:pPr>
+                <w:sdt>
+                  <w:sdtPr>
+                    <w:alias w:val="R_UNSAT"/>
+                    <w:tag w:val="R_UNSAT"/>
+                    <w:id w:val="913056"/>
+                  </w:sdtPr>
+                  <w:sdtContent>
+                    <w:r>
+                      <w:rPr>
+                        <w:sz w:val="20"/>
+                        <w:szCs w:val="20"/>
+                        <w:lang w:val="en-US"/>
+                      </w:rPr>
+                      <w:t xml:space="preserve"/>
+                    </w:r>
+                  </w:sdtContent>
+                </w:sdt>
+              </w:p>
+            </w:tc>
+            <w:tc>
+              <w:tcPr>
+                <w:tcW w:w="1085" w:type="dxa"/>
+              </w:tcPr>
+              <w:p>
+                <w:pPr>
+                  <w:rPr>
+                    <w:i/>
+                    <w:iCs/>
+                    <w:sz w:val="20"/>
+                    <w:szCs w:val="20"/>
+                    <w:lang w:val="en-US"/>
+                  </w:rPr>
+                </w:pPr>
+                <w:sdt>
+                  <w:sdtPr>
+                    <w:alias w:val="R_NONE"/>
+                    <w:tag w:val="R_NONE"/>
+                    <w:id w:val="913057"/>
+                  </w:sdtPr>
+                  <w:sdtContent>
+                    <w:r>
+                      <w:rPr>
+                        <w:i/>
+                        <w:iCs/>
+                        <w:sz w:val="20"/>
+                        <w:szCs w:val="20"/>
+                        <w:lang w:val="en-US"/>
+                      </w:rPr>
+                      <w:t xml:space="preserve"/>
+                    </w:r>
+                  </w:sdtContent>
+                </w:sdt>
+              </w:p>
+            </w:tc>
+            <w:tc>
+              <w:tcPr>
+                <w:tcW w:w="1701" w:type="dxa"/>
+              </w:tcPr>
+              <w:p>
+                <w:pPr>
+                  <w:rPr>
+                    <w:i/>
+                    <w:iCs/>
+                    <w:sz w:val="20"/>
+                    <w:szCs w:val="20"/>
+                    <w:lang w:val="en-US"/>
+                  </w:rPr>
+                </w:pPr>
+                <w:sdt>
+                  <w:sdtPr>
+                    <w:alias w:val="R_NOTE"/>
+                    <w:tag w:val="R_NOTE"/>
+                    <w:id w:val="913058"/>
+                  </w:sdtPr>
+                  <w:sdtContent>
+                    <w:r>
+                      <w:rPr>
+                        <w:i/>
+                        <w:iCs/>
+                        <w:sz w:val="20"/>
+                        <w:szCs w:val="20"/>
+                        <w:lang w:val="en-US"/>
+                      </w:rPr>
+                      <w:t xml:space="preserve"/>
+                    </w:r>
+                  </w:sdtContent>
+                </w:sdt>
+              </w:p>
+            </w:tc>
+          </w:tr>
+        </w:sdtContent>
+      </w:sdt>
+      <w:sdt>
+        <w:sdtPr>
+          <w:alias w:val="ifnot:HAS_SUPERIOR_ROWS"/>
+          <w:tag w:val="ifnot:HAS_SUPERIOR_ROWS"/>
+          <w:id w:val="913059"/>
+        </w:sdtPr>
+        <w:sdtContent>
+          <w:tr>
+            <w:tc>
+              <w:tcPr>
+                <w:tcW w:w="604" w:type="dxa"/>
+              </w:tcPr>
+              <w:p>
+                <w:pPr>
+                  <w:jc w:val="center"/>
+                  <w:rPr>
+                    <w:sz w:val="20"/>
+                    <w:szCs w:val="20"/>
+                    <w:lang w:val="en-US"/>
+                  </w:rPr>
+                </w:pPr>
+              </w:p>
+            </w:tc>
+            <w:tc>
+              <w:tcPr>
+                <w:tcW w:w="1305" w:type="dxa"/>
+              </w:tcPr>
+              <w:p>
+                <w:pPr>
+                  <w:rPr>
+                    <w:sz w:val="20"/>
+                    <w:szCs w:val="20"/>
+                    <w:lang w:val="en-US"/>
+                  </w:rPr>
+                </w:pPr>
+              </w:p>
+            </w:tc>
+            <w:tc>
+              <w:tcPr>
+                <w:tcW w:w="1347" w:type="dxa"/>
+              </w:tcPr>
+              <w:p>
+                <w:pPr>
+                  <w:rPr>
+                    <w:sz w:val="20"/>
+                    <w:szCs w:val="20"/>
+                    <w:lang w:val="en-US"/>
+                  </w:rPr>
+                </w:pPr>
+              </w:p>
+            </w:tc>
+            <w:tc>
+              <w:tcPr>
+                <w:tcW w:w="1145" w:type="dxa"/>
+              </w:tcPr>
+              <w:p>
+                <w:pPr>
+                  <w:jc w:val="center"/>
+                  <w:rPr>
+                    <w:sz w:val="20"/>
+                    <w:szCs w:val="20"/>
+                    <w:lang w:val="en-US"/>
+                  </w:rPr>
+                </w:pPr>
+              </w:p>
+            </w:tc>
+            <w:tc>
+              <w:tcPr>
+                <w:tcW w:w="1103" w:type="dxa"/>
+              </w:tcPr>
+              <w:p>
+                <w:pPr>
+                  <w:jc w:val="center"/>
+                  <w:rPr>
+                    <w:sz w:val="20"/>
+                    <w:szCs w:val="20"/>
+                    <w:lang w:val="en-US"/>
+                  </w:rPr>
+                </w:pPr>
+              </w:p>
+            </w:tc>
+            <w:tc>
+              <w:tcPr>
+                <w:tcW w:w="803" w:type="dxa"/>
+              </w:tcPr>
+              <w:p>
+                <w:pPr>
+                  <w:jc w:val="center"/>
+                  <w:rPr>
+                    <w:sz w:val="20"/>
+                    <w:szCs w:val="20"/>
+                    <w:lang w:val="en-US"/>
+                  </w:rPr>
+                </w:pPr>
+              </w:p>
+            </w:tc>
+            <w:tc>
+              <w:tcPr>
+                <w:tcW w:w="1108" w:type="dxa"/>
+              </w:tcPr>
+              <w:p>
+                <w:pPr>
+                  <w:jc w:val="center"/>
+                  <w:rPr>
+                    <w:sz w:val="20"/>
+                    <w:szCs w:val="20"/>
+                    <w:lang w:val="en-US"/>
+                  </w:rPr>
+                </w:pPr>
+              </w:p>
+            </w:tc>
+            <w:tc>
+              <w:tcPr>
+                <w:tcW w:w="1085" w:type="dxa"/>
+              </w:tcPr>
+              <w:p>
+                <w:pPr>
+                  <w:rPr>
+                    <w:i/>
+                    <w:iCs/>
+                    <w:sz w:val="20"/>
+                    <w:szCs w:val="20"/>
+                    <w:lang w:val="en-US"/>
+                  </w:rPr>
+                </w:pPr>
+              </w:p>
+            </w:tc>
+            <w:tc>
+              <w:tcPr>
+                <w:tcW w:w="1701" w:type="dxa"/>
+              </w:tcPr>
+              <w:p>
+                <w:pPr>
+                  <w:rPr>
+                    <w:i/>
+                    <w:iCs/>
+                    <w:sz w:val="20"/>
+                    <w:szCs w:val="20"/>
+                    <w:lang w:val="en-US"/>
+                  </w:rPr>
+                </w:pPr>
+              </w:p>
+            </w:tc>
+          </w:tr>
+        </w:sdtContent>
+      </w:sdt>
       <w:tr>
         <w:tc>
           <w:tcPr>
@@ -2129,9 +2947,9 @@
       </w:tr>
       <w:sdt>
         <w:sdtPr>
-          <w:alias w:val="repeat:RECORDS"/>
-          <w:tag w:val="repeat:RECORDS"/>
-          <w:id w:val="510082"/>
+          <w:alias w:val="repeat:BASE_ROWS"/>
+          <w:tag w:val="repeat:BASE_ROWS"/>
+          <w:id w:val="913049"/>
         </w:sdtPr>
         <w:sdtContent>
           <w:tr>
@@ -2140,19 +2958,28 @@
                 <w:tcW w:w="604" w:type="dxa"/>
               </w:tcPr>
               <w:p>
+                <w:pPr>
+                  <w:jc w:val="center"/>
+                  <w:rPr>
+                    <w:sz w:val="20"/>
+                    <w:szCs w:val="20"/>
+                    <w:lang w:val="en-US"/>
+                  </w:rPr>
+                </w:pPr>
                 <w:sdt>
                   <w:sdtPr>
-                    <w:alias w:val="V_STT"/>
-                    <w:tag w:val="V_STT"/>
-                    <w:id w:val="510074"/>
+                    <w:alias w:val="R_STT"/>
+                    <w:tag w:val="R_STT"/>
+                    <w:id w:val="913039"/>
                   </w:sdtPr>
                   <w:sdtContent>
                     <w:r>
                       <w:rPr>
-                        <w:rFonts w:ascii="Times New Roman" w:hAnsi="Times New Roman"/>
                         <w:sz w:val="20"/>
+                        <w:szCs w:val="20"/>
+                        <w:lang w:val="en-US"/>
                       </w:rPr>
-                      <w:t xml:space="preserve">«V_STT»</w:t>
+                      <w:t xml:space="preserve"/>
                     </w:r>
                   </w:sdtContent>
                 </w:sdt>
@@ -2163,19 +2990,27 @@
                 <w:tcW w:w="1305" w:type="dxa"/>
               </w:tcPr>
               <w:p>
+                <w:pPr>
+                  <w:rPr>
+                    <w:sz w:val="20"/>
+                    <w:szCs w:val="20"/>
+                    <w:lang w:val="en-US"/>
+                  </w:rPr>
+                </w:pPr>
                 <w:sdt>
                   <w:sdtPr>
-                    <w:alias w:val="V_NAME"/>
-                    <w:tag w:val="V_NAME"/>
-                    <w:id w:val="510075"/>
+                    <w:alias w:val="R_NAME"/>
+                    <w:tag w:val="R_NAME"/>
+                    <w:id w:val="913040"/>
                   </w:sdtPr>
                   <w:sdtContent>
                     <w:r>
                       <w:rPr>
-                        <w:rFonts w:ascii="Times New Roman" w:hAnsi="Times New Roman"/>
                         <w:sz w:val="20"/>
+                        <w:szCs w:val="20"/>
+                        <w:lang w:val="en-US"/>
                       </w:rPr>
-                      <w:t xml:space="preserve">«V_NAME»</w:t>
+                      <w:t xml:space="preserve"/>
                     </w:r>
                   </w:sdtContent>
                 </w:sdt>
@@ -2186,19 +3021,27 @@
                 <w:tcW w:w="1347" w:type="dxa"/>
               </w:tcPr>
               <w:p>
+                <w:pPr>
+                  <w:rPr>
+                    <w:sz w:val="20"/>
+                    <w:szCs w:val="20"/>
+                    <w:lang w:val="en-US"/>
+                  </w:rPr>
+                </w:pPr>
                 <w:sdt>
                   <w:sdtPr>
-                    <w:alias w:val="V_POSITION_DEPT"/>
-                    <w:tag w:val="V_POSITION_DEPT"/>
-                    <w:id w:val="510076"/>
+                    <w:alias w:val="R_POSITION"/>
+                    <w:tag w:val="R_POSITION"/>
+                    <w:id w:val="913041"/>
                   </w:sdtPr>
                   <w:sdtContent>
                     <w:r>
                       <w:rPr>
-                        <w:rFonts w:ascii="Times New Roman" w:hAnsi="Times New Roman"/>
                         <w:sz w:val="20"/>
+                        <w:szCs w:val="20"/>
+                        <w:lang w:val="en-US"/>
                       </w:rPr>
-                      <w:t xml:space="preserve">«V_POSITION_DEPT»</w:t>
+                      <w:t xml:space="preserve"/>
                     </w:r>
                   </w:sdtContent>
                 </w:sdt>
@@ -2209,19 +3052,28 @@
                 <w:tcW w:w="1145" w:type="dxa"/>
               </w:tcPr>
               <w:p>
+                <w:pPr>
+                  <w:jc w:val="center"/>
+                  <w:rPr>
+                    <w:sz w:val="20"/>
+                    <w:szCs w:val="20"/>
+                    <w:lang w:val="en-US"/>
+                  </w:rPr>
+                </w:pPr>
                 <w:sdt>
                   <w:sdtPr>
-                    <w:alias w:val="V_EXC"/>
-                    <w:tag w:val="V_EXC"/>
-                    <w:id w:val="510077"/>
+                    <w:alias w:val="R_EXC"/>
+                    <w:tag w:val="R_EXC"/>
+                    <w:id w:val="913042"/>
                   </w:sdtPr>
                   <w:sdtContent>
                     <w:r>
                       <w:rPr>
-                        <w:rFonts w:ascii="Times New Roman" w:hAnsi="Times New Roman"/>
                         <w:sz w:val="20"/>
+                        <w:szCs w:val="20"/>
+                        <w:lang w:val="en-US"/>
                       </w:rPr>
-                      <w:t xml:space="preserve">«V_EXC»</w:t>
+                      <w:t xml:space="preserve"/>
                     </w:r>
                   </w:sdtContent>
                 </w:sdt>
@@ -2232,19 +3084,28 @@
                 <w:tcW w:w="1103" w:type="dxa"/>
               </w:tcPr>
               <w:p>
+                <w:pPr>
+                  <w:jc w:val="center"/>
+                  <w:rPr>
+                    <w:sz w:val="20"/>
+                    <w:szCs w:val="20"/>
+                    <w:lang w:val="en-US"/>
+                  </w:rPr>
+                </w:pPr>
                 <w:sdt>
                   <w:sdtPr>
-                    <w:alias w:val="V_GOOD"/>
-                    <w:tag w:val="V_GOOD"/>
-                    <w:id w:val="510078"/>
+                    <w:alias w:val="R_GOOD"/>
+                    <w:tag w:val="R_GOOD"/>
+                    <w:id w:val="913043"/>
                   </w:sdtPr>
                   <w:sdtContent>
                     <w:r>
                       <w:rPr>
-                        <w:rFonts w:ascii="Times New Roman" w:hAnsi="Times New Roman"/>
                         <w:sz w:val="20"/>
+                        <w:szCs w:val="20"/>
+                        <w:lang w:val="en-US"/>
                       </w:rPr>
-                      <w:t xml:space="preserve">«V_GOOD»</w:t>
+                      <w:t xml:space="preserve"/>
                     </w:r>
                   </w:sdtContent>
                 </w:sdt>
@@ -2255,19 +3116,28 @@
                 <w:tcW w:w="803" w:type="dxa"/>
               </w:tcPr>
               <w:p>
+                <w:pPr>
+                  <w:jc w:val="center"/>
+                  <w:rPr>
+                    <w:sz w:val="20"/>
+                    <w:szCs w:val="20"/>
+                    <w:lang w:val="en-US"/>
+                  </w:rPr>
+                </w:pPr>
                 <w:sdt>
                   <w:sdtPr>
-                    <w:alias w:val="V_SAT"/>
-                    <w:tag w:val="V_SAT"/>
-                    <w:id w:val="510079"/>
+                    <w:alias w:val="R_SAT"/>
+                    <w:tag w:val="R_SAT"/>
+                    <w:id w:val="913044"/>
                   </w:sdtPr>
                   <w:sdtContent>
                     <w:r>
                       <w:rPr>
-                        <w:rFonts w:ascii="Times New Roman" w:hAnsi="Times New Roman"/>
                         <w:sz w:val="20"/>
+                        <w:szCs w:val="20"/>
+                        <w:lang w:val="en-US"/>
                       </w:rPr>
-                      <w:t xml:space="preserve">«V_SAT»</w:t>
+                      <w:t xml:space="preserve"/>
                     </w:r>
                   </w:sdtContent>
                 </w:sdt>
@@ -2278,19 +3148,28 @@
                 <w:tcW w:w="1108" w:type="dxa"/>
               </w:tcPr>
               <w:p>
+                <w:pPr>
+                  <w:jc w:val="center"/>
+                  <w:rPr>
+                    <w:sz w:val="20"/>
+                    <w:szCs w:val="20"/>
+                    <w:lang w:val="en-US"/>
+                  </w:rPr>
+                </w:pPr>
                 <w:sdt>
                   <w:sdtPr>
-                    <w:alias w:val="V_UNSAT"/>
-                    <w:tag w:val="V_UNSAT"/>
-                    <w:id w:val="510080"/>
+                    <w:alias w:val="R_UNSAT"/>
+                    <w:tag w:val="R_UNSAT"/>
+                    <w:id w:val="913045"/>
                   </w:sdtPr>
                   <w:sdtContent>
                     <w:r>
                       <w:rPr>
-                        <w:rFonts w:ascii="Times New Roman" w:hAnsi="Times New Roman"/>
                         <w:sz w:val="20"/>
+                        <w:szCs w:val="20"/>
+                        <w:lang w:val="en-US"/>
                       </w:rPr>
-                      <w:t xml:space="preserve">«V_UNSAT»</w:t>
+                      <w:t xml:space="preserve"/>
                     </w:r>
                   </w:sdtContent>
                 </w:sdt>
@@ -2301,13 +3180,34 @@
                 <w:tcW w:w="1085" w:type="dxa"/>
               </w:tcPr>
               <w:p>
-                <w:r>
+                <w:pPr>
                   <w:rPr>
-                    <w:rFonts w:ascii="Times New Roman" w:hAnsi="Times New Roman"/>
+                    <w:i/>
+                    <w:iCs/>
                     <w:sz w:val="20"/>
+                    <w:szCs w:val="20"/>
+                    <w:lang w:val="en-US"/>
                   </w:rPr>
-                  <w:t/>
-                </w:r>
+                </w:pPr>
+                <w:sdt>
+                  <w:sdtPr>
+                    <w:alias w:val="R_NONE"/>
+                    <w:tag w:val="R_NONE"/>
+                    <w:id w:val="913046"/>
+                  </w:sdtPr>
+                  <w:sdtContent>
+                    <w:r>
+                      <w:rPr>
+                        <w:i/>
+                        <w:iCs/>
+                        <w:sz w:val="20"/>
+                        <w:szCs w:val="20"/>
+                        <w:lang w:val="en-US"/>
+                      </w:rPr>
+                      <w:t xml:space="preserve"/>
+                    </w:r>
+                  </w:sdtContent>
+                </w:sdt>
               </w:p>
             </w:tc>
             <w:tc>
@@ -2315,22 +3215,180 @@
                 <w:tcW w:w="1701" w:type="dxa"/>
               </w:tcPr>
               <w:p>
+                <w:pPr>
+                  <w:rPr>
+                    <w:i/>
+                    <w:iCs/>
+                    <w:sz w:val="20"/>
+                    <w:szCs w:val="20"/>
+                    <w:lang w:val="en-US"/>
+                  </w:rPr>
+                </w:pPr>
                 <w:sdt>
                   <w:sdtPr>
-                    <w:alias w:val="V_PCT"/>
-                    <w:tag w:val="V_PCT"/>
-                    <w:id w:val="510081"/>
+                    <w:alias w:val="R_NOTE"/>
+                    <w:tag w:val="R_NOTE"/>
+                    <w:id w:val="913047"/>
                   </w:sdtPr>
                   <w:sdtContent>
                     <w:r>
                       <w:rPr>
-                        <w:rFonts w:ascii="Times New Roman" w:hAnsi="Times New Roman"/>
+                        <w:i/>
+                        <w:iCs/>
                         <w:sz w:val="20"/>
+                        <w:szCs w:val="20"/>
+                        <w:lang w:val="en-US"/>
                       </w:rPr>
-                      <w:t xml:space="preserve">«V_PCT»</w:t>
+                      <w:t xml:space="preserve"/>
                     </w:r>
                   </w:sdtContent>
                 </w:sdt>
+              </w:p>
+            </w:tc>
+          </w:tr>
+        </w:sdtContent>
+      </w:sdt>
+      <w:sdt>
+        <w:sdtPr>
+          <w:alias w:val="ifnot:HAS_BASE_ROWS"/>
+          <w:tag w:val="ifnot:HAS_BASE_ROWS"/>
+          <w:id w:val="913048"/>
+        </w:sdtPr>
+        <w:sdtContent>
+          <w:tr>
+            <w:tc>
+              <w:tcPr>
+                <w:tcW w:w="604" w:type="dxa"/>
+              </w:tcPr>
+              <w:p>
+                <w:pPr>
+                  <w:jc w:val="center"/>
+                  <w:rPr>
+                    <w:sz w:val="20"/>
+                    <w:szCs w:val="20"/>
+                    <w:lang w:val="en-US"/>
+                  </w:rPr>
+                </w:pPr>
+              </w:p>
+            </w:tc>
+            <w:tc>
+              <w:tcPr>
+                <w:tcW w:w="1305" w:type="dxa"/>
+              </w:tcPr>
+              <w:p>
+                <w:pPr>
+                  <w:rPr>
+                    <w:sz w:val="20"/>
+                    <w:szCs w:val="20"/>
+                    <w:lang w:val="en-US"/>
+                  </w:rPr>
+                </w:pPr>
+              </w:p>
+            </w:tc>
+            <w:tc>
+              <w:tcPr>
+                <w:tcW w:w="1347" w:type="dxa"/>
+              </w:tcPr>
+              <w:p>
+                <w:pPr>
+                  <w:rPr>
+                    <w:sz w:val="20"/>
+                    <w:szCs w:val="20"/>
+                    <w:lang w:val="en-US"/>
+                  </w:rPr>
+                </w:pPr>
+              </w:p>
+            </w:tc>
+            <w:tc>
+              <w:tcPr>
+                <w:tcW w:w="1145" w:type="dxa"/>
+              </w:tcPr>
+              <w:p>
+                <w:pPr>
+                  <w:jc w:val="center"/>
+                  <w:rPr>
+                    <w:sz w:val="20"/>
+                    <w:szCs w:val="20"/>
+                    <w:lang w:val="en-US"/>
+                  </w:rPr>
+                </w:pPr>
+              </w:p>
+            </w:tc>
+            <w:tc>
+              <w:tcPr>
+                <w:tcW w:w="1103" w:type="dxa"/>
+              </w:tcPr>
+              <w:p>
+                <w:pPr>
+                  <w:jc w:val="center"/>
+                  <w:rPr>
+                    <w:sz w:val="20"/>
+                    <w:szCs w:val="20"/>
+                    <w:lang w:val="en-US"/>
+                  </w:rPr>
+                </w:pPr>
+              </w:p>
+            </w:tc>
+            <w:tc>
+              <w:tcPr>
+                <w:tcW w:w="803" w:type="dxa"/>
+              </w:tcPr>
+              <w:p>
+                <w:pPr>
+                  <w:jc w:val="center"/>
+                  <w:rPr>
+                    <w:sz w:val="20"/>
+                    <w:szCs w:val="20"/>
+                    <w:lang w:val="en-US"/>
+                  </w:rPr>
+                </w:pPr>
+              </w:p>
+            </w:tc>
+            <w:tc>
+              <w:tcPr>
+                <w:tcW w:w="1108" w:type="dxa"/>
+              </w:tcPr>
+              <w:p>
+                <w:pPr>
+                  <w:jc w:val="center"/>
+                  <w:rPr>
+                    <w:sz w:val="20"/>
+                    <w:szCs w:val="20"/>
+                    <w:lang w:val="en-US"/>
+                  </w:rPr>
+                </w:pPr>
+              </w:p>
+            </w:tc>
+            <w:tc>
+              <w:tcPr>
+                <w:tcW w:w="1085" w:type="dxa"/>
+              </w:tcPr>
+              <w:p>
+                <w:pPr>
+                  <w:rPr>
+                    <w:i/>
+                    <w:iCs/>
+                    <w:sz w:val="20"/>
+                    <w:szCs w:val="20"/>
+                    <w:lang w:val="en-US"/>
+                  </w:rPr>
+                </w:pPr>
+              </w:p>
+            </w:tc>
+            <w:tc>
+              <w:tcPr>
+                <w:tcW w:w="1701" w:type="dxa"/>
+              </w:tcPr>
+              <w:p>
+                <w:pPr>
+                  <w:rPr>
+                    <w:i/>
+                    <w:iCs/>
+                    <w:sz w:val="20"/>
+                    <w:szCs w:val="20"/>
+                    <w:lang w:val="en-US"/>
+                  </w:rPr>
+                </w:pPr>
               </w:p>
             </w:tc>
           </w:tr>
@@ -2368,7 +3426,53 @@
           <w:sz w:val="28"/>
           <w:szCs w:val="28"/>
         </w:rPr>
-        <w:t>Hội nghị kết thúc vào hồi …h… cùng ngày. Biên bản này được lập thành 03 bản (01 bản báo cáo cấp ủy cấp trên, 01 bản lưu tại Đảng ủy/Chi bộ… và 01 bản lưu hồ sơ công việc)./.</w:t>
+        <w:t xml:space="preserve">Hội nghị kết thúc vào hồi </w:t>
+      </w:r>
+      <w:sdt>
+        <w:sdtPr>
+          <w:alias w:val="END_TIME"/>
+          <w:tag w:val="END_TIME"/>
+          <w:id w:val="913061"/>
+        </w:sdtPr>
+        <w:sdtContent>
+          <w:r>
+            <w:rPr>
+              <w:sz w:val="28"/>
+              <w:szCs w:val="28"/>
+            </w:rPr>
+            <w:t xml:space="preserve">…h…</w:t>
+          </w:r>
+        </w:sdtContent>
+      </w:sdt>
+      <w:r>
+        <w:rPr>
+          <w:sz w:val="28"/>
+          <w:szCs w:val="28"/>
+        </w:rPr>
+        <w:t xml:space="preserve"> cùng ngày. Biên bản này được lập thành 03 bản (01 bản báo cáo cấp ủy cấp trên, 01 bản lưu tại </w:t>
+      </w:r>
+      <w:sdt>
+        <w:sdtPr>
+          <w:alias w:val="ARCHIVE_UNIT"/>
+          <w:tag w:val="ARCHIVE_UNIT"/>
+          <w:id w:val="913062"/>
+        </w:sdtPr>
+        <w:sdtContent>
+          <w:r>
+            <w:rPr>
+              <w:sz w:val="28"/>
+              <w:szCs w:val="28"/>
+            </w:rPr>
+            <w:t xml:space="preserve">Đảng ủy/Chi bộ…</w:t>
+          </w:r>
+        </w:sdtContent>
+      </w:sdt>
+      <w:r>
+        <w:rPr>
+          <w:sz w:val="28"/>
+          <w:szCs w:val="28"/>
+        </w:rPr>
+        <w:t xml:space="preserve"> và 01 bản lưu hồ sơ công việc)./.</w:t>
       </w:r>
     </w:p>
     <w:tbl>
@@ -2450,6 +3554,105 @@
               </w:rPr>
               <w:t>(ký, ghi rõ họ tên)</w:t>
             </w:r>
+          </w:p>
+          <w:p>
+            <w:pPr>
+              <w:spacing w:after="0" w:line="240" w:lineRule="auto"/>
+              <w:ind w:firstLine="709"/>
+              <w:jc w:val="center"/>
+              <w:rPr>
+                <w:bCs/>
+                <w:i/>
+                <w:iCs/>
+                <w:sz w:val="20"/>
+                <w:szCs w:val="20"/>
+              </w:rPr>
+            </w:pPr>
+          </w:p>
+          <w:p>
+            <w:pPr>
+              <w:spacing w:after="0" w:line="240" w:lineRule="auto"/>
+              <w:ind w:firstLine="709"/>
+              <w:jc w:val="center"/>
+              <w:rPr>
+                <w:bCs/>
+                <w:i/>
+                <w:iCs/>
+                <w:sz w:val="20"/>
+                <w:szCs w:val="20"/>
+              </w:rPr>
+            </w:pPr>
+          </w:p>
+          <w:p>
+            <w:pPr>
+              <w:spacing w:after="0" w:line="240" w:lineRule="auto"/>
+              <w:ind w:firstLine="709"/>
+              <w:jc w:val="center"/>
+              <w:rPr>
+                <w:bCs/>
+                <w:i/>
+                <w:iCs/>
+                <w:sz w:val="20"/>
+                <w:szCs w:val="20"/>
+              </w:rPr>
+            </w:pPr>
+          </w:p>
+          <w:p>
+            <w:pPr>
+              <w:spacing w:after="0" w:line="240" w:lineRule="auto"/>
+              <w:ind w:firstLine="709"/>
+              <w:jc w:val="center"/>
+              <w:rPr>
+                <w:bCs/>
+                <w:i/>
+                <w:iCs/>
+                <w:sz w:val="20"/>
+                <w:szCs w:val="20"/>
+              </w:rPr>
+            </w:pPr>
+          </w:p>
+          <w:p>
+            <w:pPr>
+              <w:spacing w:after="0" w:line="240" w:lineRule="auto"/>
+              <w:ind w:firstLine="709"/>
+              <w:jc w:val="center"/>
+              <w:rPr>
+                <w:bCs/>
+                <w:i/>
+                <w:iCs/>
+                <w:sz w:val="20"/>
+                <w:szCs w:val="20"/>
+              </w:rPr>
+            </w:pPr>
+          </w:p>
+          <w:p>
+            <w:pPr>
+              <w:spacing w:after="0" w:line="240" w:lineRule="auto"/>
+              <w:ind w:firstLine="709"/>
+              <w:jc w:val="center"/>
+              <w:rPr>
+                <w:b/>
+                <w:sz w:val="28"/>
+                <w:szCs w:val="28"/>
+              </w:rPr>
+            </w:pPr>
+            <w:sdt>
+              <w:sdtPr>
+                <w:alias w:val="COUNTER_HEAD_SIGN"/>
+                <w:tag w:val="COUNTER_HEAD_SIGN"/>
+                <w:id w:val="913063"/>
+              </w:sdtPr>
+              <w:sdtContent>
+                <w:r>
+                  <w:rPr>
+                    <w:b/>
+                    <w:sz w:val="28"/>
+                    <w:szCs w:val="28"/>
+                  </w:rPr>
+                  <w:t xml:space="preserve"> </w:t>
+                </w:r>
+              </w:sdtContent>
+            </w:sdt>
           </w:p>
         </w:tc>
         <w:tc>
@@ -2535,6 +3738,105 @@
               <w:t>(ký, ghi rõ họ tên, đóng dấu)</w:t>
             </w:r>
           </w:p>
+          <w:p>
+            <w:pPr>
+              <w:spacing w:after="0" w:line="240" w:lineRule="auto"/>
+              <w:ind w:firstLine="709"/>
+              <w:jc w:val="center"/>
+              <w:rPr>
+                <w:bCs/>
+                <w:i/>
+                <w:iCs/>
+                <w:sz w:val="20"/>
+                <w:szCs w:val="20"/>
+              </w:rPr>
+            </w:pPr>
+          </w:p>
+          <w:p>
+            <w:pPr>
+              <w:spacing w:after="0" w:line="240" w:lineRule="auto"/>
+              <w:ind w:firstLine="709"/>
+              <w:jc w:val="center"/>
+              <w:rPr>
+                <w:bCs/>
+                <w:i/>
+                <w:iCs/>
+                <w:sz w:val="20"/>
+                <w:szCs w:val="20"/>
+              </w:rPr>
+            </w:pPr>
+          </w:p>
+          <w:p>
+            <w:pPr>
+              <w:spacing w:after="0" w:line="240" w:lineRule="auto"/>
+              <w:ind w:firstLine="709"/>
+              <w:jc w:val="center"/>
+              <w:rPr>
+                <w:bCs/>
+                <w:i/>
+                <w:iCs/>
+                <w:sz w:val="20"/>
+                <w:szCs w:val="20"/>
+              </w:rPr>
+            </w:pPr>
+          </w:p>
+          <w:p>
+            <w:pPr>
+              <w:spacing w:after="0" w:line="240" w:lineRule="auto"/>
+              <w:ind w:firstLine="709"/>
+              <w:jc w:val="center"/>
+              <w:rPr>
+                <w:bCs/>
+                <w:i/>
+                <w:iCs/>
+                <w:sz w:val="20"/>
+                <w:szCs w:val="20"/>
+              </w:rPr>
+            </w:pPr>
+          </w:p>
+          <w:p>
+            <w:pPr>
+              <w:spacing w:after="0" w:line="240" w:lineRule="auto"/>
+              <w:ind w:firstLine="709"/>
+              <w:jc w:val="center"/>
+              <w:rPr>
+                <w:bCs/>
+                <w:i/>
+                <w:iCs/>
+                <w:sz w:val="20"/>
+                <w:szCs w:val="20"/>
+              </w:rPr>
+            </w:pPr>
+          </w:p>
+          <w:p>
+            <w:pPr>
+              <w:spacing w:after="0" w:line="240" w:lineRule="auto"/>
+              <w:ind w:firstLine="709"/>
+              <w:jc w:val="center"/>
+              <w:rPr>
+                <w:b/>
+                <w:sz w:val="28"/>
+                <w:szCs w:val="28"/>
+              </w:rPr>
+            </w:pPr>
+            <w:sdt>
+              <w:sdtPr>
+                <w:alias w:val="CHAIR_SIGN"/>
+                <w:tag w:val="CHAIR_SIGN"/>
+                <w:id w:val="913064"/>
+              </w:sdtPr>
+              <w:sdtContent>
+                <w:r>
+                  <w:rPr>
+                    <w:b/>
+                    <w:sz w:val="28"/>
+                    <w:szCs w:val="28"/>
+                  </w:rPr>
+                  <w:t xml:space="preserve"> </w:t>
+                </w:r>
+              </w:sdtContent>
+            </w:sdt>
+          </w:p>
         </w:tc>
       </w:tr>
     </w:tbl>
@@ -2543,42 +3845,8 @@
         <w:ind w:firstLine="709"/>
       </w:pPr>
     </w:p>
-    <w:p>
-      <w:pPr>
-        <w:spacing w:after="0"/>
-        <w:rPr>
-          <w:lang w:val="en-US"/>
-        </w:rPr>
-        <w:sectPr>
-          <w:pgSz w:w="11906" w:h="16838"/>
-          <w:pgMar w:top="1021" w:right="851" w:bottom="1021" w:left="851" w:header="720" w:footer="720" w:gutter="0"/>
-          <w:cols w:space="720"/>
-          <w:docGrid w:linePitch="360"/>
-        </w:sectPr>
-      </w:pPr>
-    </w:p>
-    <w:p>
-      <w:pPr>
-        <w:spacing w:after="0" w:line="240" w:lineRule="auto"/>
-        <w:rPr>
-          <w:rFonts w:eastAsia="Calibri"/>
-          <w:kern w:val="2"/>
-          <w:sz w:val="24"/>
-          <w:szCs w:val="24"/>
-          <w:lang w:val="en-US" w:eastAsia="en-US"/>
-          <w14:ligatures w14:val="standardContextual"/>
-        </w:rPr>
-        <w:sectPr>
-          <w:type w:val="continuous"/>
-          <w:pgSz w:w="11906" w:h="16838"/>
-          <w:pgMar w:top="1021" w:right="851" w:bottom="1021" w:left="851" w:header="720" w:footer="720" w:gutter="0"/>
-          <w:cols w:space="720"/>
-          <w:docGrid w:linePitch="360"/>
-        </w:sectPr>
-      </w:pPr>
-    </w:p>
     <w:sectPr>
-      <w:pgSz w:w="11906" w:h="16838" w:orient="portrait"/>
+      <w:pgSz w:w="11906" w:h="16838"/>
       <w:pgMar w:top="1021" w:right="851" w:bottom="1021" w:left="851" w:header="720" w:footer="720" w:gutter="0"/>
       <w:cols w:space="720"/>
       <w:docGrid w:linePitch="360"/>

</xml_diff>